<commit_message>
added dark and light theme
</commit_message>
<xml_diff>
--- a/public/Manoj_Mehta_Resume.docx
+++ b/public/Manoj_Mehta_Resume.docx
@@ -4,6 +4,65 @@
   <w:body>
     <w:p>
       <w:pPr>
+        <w:pStyle w:val="div"/>
+        <w:spacing w:line="260" w:lineRule="atLeast"/>
+        <w:jc w:val="center"/>
+        <w:rPr>
+          <w:rFonts w:ascii="Palatino Linotype" w:eastAsia="Palatino Linotype" w:hAnsi="Palatino Linotype" w:cs="Palatino Linotype"/>
+          <w:color w:val="4A4A4A"/>
+          <w:sz w:val="20"/>
+          <w:szCs w:val="20"/>
+        </w:rPr>
+      </w:pPr>
+      <w:r>
+        <w:rPr>
+          <w:rFonts w:ascii="Palatino Linotype" w:eastAsia="Palatino Linotype" w:hAnsi="Palatino Linotype" w:cs="Palatino Linotype"/>
+          <w:noProof/>
+          <w:color w:val="4A4A4A"/>
+          <w:sz w:val="20"/>
+          <w:szCs w:val="20"/>
+        </w:rPr>
+        <w:drawing>
+          <wp:inline distT="0" distB="0" distL="0" distR="0" wp14:anchorId="0D078735" wp14:editId="74DAACF4">
+            <wp:extent cx="634219" cy="634570"/>
+            <wp:effectExtent l="0" t="0" r="0" b="0"/>
+            <wp:docPr id="100001" name="Picture 100001"/>
+            <wp:cNvGraphicFramePr>
+              <a:graphicFrameLocks xmlns:a="http://schemas.openxmlformats.org/drawingml/2006/main" noChangeAspect="1"/>
+            </wp:cNvGraphicFramePr>
+            <a:graphic xmlns:a="http://schemas.openxmlformats.org/drawingml/2006/main">
+              <a:graphicData uri="http://schemas.openxmlformats.org/drawingml/2006/picture">
+                <pic:pic xmlns:pic="http://schemas.openxmlformats.org/drawingml/2006/picture">
+                  <pic:nvPicPr>
+                    <pic:cNvPr id="100001" name=""/>
+                    <pic:cNvPicPr>
+                      <a:picLocks noChangeAspect="1"/>
+                    </pic:cNvPicPr>
+                  </pic:nvPicPr>
+                  <pic:blipFill>
+                    <a:blip r:embed="rId5"/>
+                    <a:stretch>
+                      <a:fillRect/>
+                    </a:stretch>
+                  </pic:blipFill>
+                  <pic:spPr>
+                    <a:xfrm>
+                      <a:off x="0" y="0"/>
+                      <a:ext cx="634219" cy="634570"/>
+                    </a:xfrm>
+                    <a:prstGeom prst="rect">
+                      <a:avLst/>
+                    </a:prstGeom>
+                  </pic:spPr>
+                </pic:pic>
+              </a:graphicData>
+            </a:graphic>
+          </wp:inline>
+        </w:drawing>
+      </w:r>
+    </w:p>
+    <w:p>
+      <w:pPr>
         <w:pStyle w:val="divname"/>
         <w:rPr>
           <w:rFonts w:ascii="Palatino Linotype" w:eastAsia="Palatino Linotype" w:hAnsi="Palatino Linotype" w:cs="Palatino Linotype"/>
@@ -39,13 +98,28 @@
         <w:pStyle w:val="divaddress"/>
         <w:spacing w:before="100"/>
         <w:rPr>
+          <w:rFonts w:ascii="Palatino Linotype" w:eastAsia="Palatino Linotype" w:hAnsi="Palatino Linotype" w:cs="Palatino Linotype"/>
+          <w:color w:val="4A4A4A"/>
+        </w:rPr>
+      </w:pPr>
+      <w:r>
+        <w:rPr>
           <w:rStyle w:val="span"/>
           <w:rFonts w:ascii="Palatino Linotype" w:eastAsia="Palatino Linotype" w:hAnsi="Palatino Linotype" w:cs="Palatino Linotype"/>
           <w:color w:val="4A4A4A"/>
           <w:sz w:val="20"/>
           <w:szCs w:val="20"/>
         </w:rPr>
-      </w:pPr>
+        <w:t xml:space="preserve">meh.manoj@gmail.com </w:t>
+      </w:r>
+      <w:r>
+        <w:rPr>
+          <w:rStyle w:val="sprtr"/>
+          <w:rFonts w:ascii="Palatino Linotype" w:eastAsia="Palatino Linotype" w:hAnsi="Palatino Linotype" w:cs="Palatino Linotype"/>
+          <w:color w:val="4A4A4A"/>
+        </w:rPr>
+        <w:t>  |  </w:t>
+      </w:r>
       <w:r>
         <w:rPr>
           <w:rStyle w:val="span"/>
@@ -54,7 +128,7 @@
           <w:sz w:val="20"/>
           <w:szCs w:val="20"/>
         </w:rPr>
-        <w:t xml:space="preserve">meh.manoj@gmail.com </w:t>
+        <w:t xml:space="preserve"> 9496915115 </w:t>
       </w:r>
       <w:r>
         <w:rPr>
@@ -72,215 +146,80 @@
           <w:sz w:val="20"/>
           <w:szCs w:val="20"/>
         </w:rPr>
-        <w:t xml:space="preserve"> 9496915115 </w:t>
+        <w:t xml:space="preserve"> Irvine, CA 92604 </w:t>
       </w:r>
-      <w:r>
-        <w:rPr>
-          <w:rStyle w:val="sprtr"/>
-          <w:rFonts w:ascii="Palatino Linotype" w:eastAsia="Palatino Linotype" w:hAnsi="Palatino Linotype" w:cs="Palatino Linotype"/>
-          <w:color w:val="4A4A4A"/>
-        </w:rPr>
-        <w:t>  |  </w:t>
-      </w:r>
-      <w:r>
-        <w:rPr>
-          <w:rStyle w:val="span"/>
+    </w:p>
+    <w:p>
+      <w:pPr>
+        <w:pStyle w:val="divdocumentheading"/>
+        <w:tabs>
+          <w:tab w:val="center" w:pos="10840"/>
+        </w:tabs>
+        <w:spacing w:before="300" w:line="260" w:lineRule="atLeast"/>
+        <w:rPr>
           <w:rFonts w:ascii="Palatino Linotype" w:eastAsia="Palatino Linotype" w:hAnsi="Palatino Linotype" w:cs="Palatino Linotype"/>
           <w:color w:val="4A4A4A"/>
           <w:sz w:val="20"/>
           <w:szCs w:val="20"/>
         </w:rPr>
-        <w:t xml:space="preserve"> Irvine, CA</w:t>
+      </w:pPr>
+      <w:r>
+        <w:rPr>
+          <w:rStyle w:val="divdocumentdivsectiontitle"/>
+          <w:rFonts w:ascii="Palatino Linotype" w:eastAsia="Palatino Linotype" w:hAnsi="Palatino Linotype" w:cs="Palatino Linotype"/>
+        </w:rPr>
+        <w:t xml:space="preserve">Summary   </w:t>
+      </w:r>
+      <w:r>
+        <w:rPr>
+          <w:rFonts w:ascii="Palatino Linotype" w:eastAsia="Palatino Linotype" w:hAnsi="Palatino Linotype" w:cs="Palatino Linotype"/>
+          <w:strike/>
+          <w:color w:val="BCBFC3"/>
+        </w:rPr>
+        <w:t xml:space="preserve"> </w:t>
+      </w:r>
+      <w:r>
+        <w:rPr>
+          <w:rFonts w:ascii="Palatino Linotype" w:eastAsia="Palatino Linotype" w:hAnsi="Palatino Linotype" w:cs="Palatino Linotype"/>
+          <w:strike/>
+          <w:color w:val="BCBFC3"/>
+        </w:rPr>
+        <w:tab/>
       </w:r>
     </w:p>
     <w:p>
       <w:pPr>
-        <w:pStyle w:val="divaddress"/>
-        <w:spacing w:before="100"/>
-        <w:rPr>
-          <w:rFonts w:ascii="Palatino Linotype" w:eastAsia="Palatino Linotype" w:hAnsi="Palatino Linotype" w:cs="Palatino Linotype"/>
-          <w:color w:val="4A4A4A"/>
-        </w:rPr>
-      </w:pPr>
-      <w:r>
-        <w:rPr>
-          <w:rStyle w:val="span"/>
+        <w:pStyle w:val="p"/>
+        <w:spacing w:line="260" w:lineRule="atLeast"/>
+        <w:rPr>
           <w:rFonts w:ascii="Palatino Linotype" w:eastAsia="Palatino Linotype" w:hAnsi="Palatino Linotype" w:cs="Palatino Linotype"/>
           <w:color w:val="4A4A4A"/>
           <w:sz w:val="20"/>
           <w:szCs w:val="20"/>
         </w:rPr>
-        <w:t>LinkedIn: linkedin.com/in/manoj-mehta-4486302</w:t>
-      </w:r>
+      </w:pPr>
       <w:r>
         <w:rPr>
-          <w:rStyle w:val="span"/>
           <w:rFonts w:ascii="Palatino Linotype" w:eastAsia="Palatino Linotype" w:hAnsi="Palatino Linotype" w:cs="Palatino Linotype"/>
           <w:color w:val="4A4A4A"/>
           <w:sz w:val="20"/>
           <w:szCs w:val="20"/>
         </w:rPr>
-        <w:t xml:space="preserve"> | https://</w:t>
+        <w:t>Senior Software Engineer and hands-on frontend architect with 20+ years of experience building scalable UI platforms across telecom, financial services, retail, and Fortune 500 environments. Proven leader driving delivery speed, developer productivity, and system scalability through platform engineering.</w:t>
       </w:r>
-      <w:r>
-        <w:rPr>
-          <w:rStyle w:val="span"/>
+    </w:p>
+    <w:p>
+      <w:pPr>
+        <w:pStyle w:val="divdocumentheading"/>
+        <w:tabs>
+          <w:tab w:val="center" w:pos="10840"/>
+        </w:tabs>
+        <w:spacing w:before="300" w:line="260" w:lineRule="atLeast"/>
+        <w:rPr>
           <w:rFonts w:ascii="Palatino Linotype" w:eastAsia="Palatino Linotype" w:hAnsi="Palatino Linotype" w:cs="Palatino Linotype"/>
           <w:color w:val="4A4A4A"/>
           <w:sz w:val="20"/>
           <w:szCs w:val="20"/>
-        </w:rPr>
-        <w:t>manoj-mehta.com</w:t>
-      </w:r>
-    </w:p>
-    <w:p>
-      <w:pPr>
-        <w:pStyle w:val="divdocumentheading"/>
-        <w:tabs>
-          <w:tab w:val="center" w:pos="10840"/>
-        </w:tabs>
-        <w:spacing w:before="300" w:line="260" w:lineRule="atLeast"/>
-        <w:rPr>
-          <w:rFonts w:ascii="Palatino Linotype" w:eastAsia="Palatino Linotype" w:hAnsi="Palatino Linotype" w:cs="Palatino Linotype"/>
-          <w:color w:val="4A4A4A"/>
-          <w:sz w:val="20"/>
-          <w:szCs w:val="20"/>
-        </w:rPr>
-      </w:pPr>
-      <w:r>
-        <w:rPr>
-          <w:rStyle w:val="divdocumentdivsectiontitle"/>
-          <w:rFonts w:ascii="Palatino Linotype" w:eastAsia="Palatino Linotype" w:hAnsi="Palatino Linotype" w:cs="Palatino Linotype"/>
-        </w:rPr>
-        <w:t xml:space="preserve">Summary   </w:t>
-      </w:r>
-      <w:r>
-        <w:rPr>
-          <w:rFonts w:ascii="Palatino Linotype" w:eastAsia="Palatino Linotype" w:hAnsi="Palatino Linotype" w:cs="Palatino Linotype"/>
-          <w:strike/>
-          <w:color w:val="BCBFC3"/>
-        </w:rPr>
-        <w:t xml:space="preserve"> </w:t>
-      </w:r>
-      <w:r>
-        <w:rPr>
-          <w:rFonts w:ascii="Palatino Linotype" w:eastAsia="Palatino Linotype" w:hAnsi="Palatino Linotype" w:cs="Palatino Linotype"/>
-          <w:strike/>
-          <w:color w:val="BCBFC3"/>
-        </w:rPr>
-        <w:tab/>
-      </w:r>
-      <w:r>
-        <w:rPr>
-          <w:rFonts w:ascii="Palatino Linotype" w:eastAsia="Palatino Linotype" w:hAnsi="Palatino Linotype" w:cs="Palatino Linotype"/>
-          <w:color w:val="4A4A4A"/>
-          <w:sz w:val="20"/>
-          <w:szCs w:val="20"/>
-        </w:rPr>
-        <w:br/>
-      </w:r>
-      <w:r>
-        <w:rPr>
-          <w:rFonts w:ascii="Palatino Linotype" w:eastAsia="Palatino Linotype" w:hAnsi="Palatino Linotype" w:cs="Palatino Linotype"/>
-          <w:color w:val="4A4A4A"/>
-          <w:sz w:val="20"/>
-          <w:szCs w:val="20"/>
-        </w:rPr>
-        <w:br/>
-      </w:r>
-      <w:r>
-        <w:rPr>
-          <w:rFonts w:ascii="Palatino Linotype" w:eastAsia="Palatino Linotype" w:hAnsi="Palatino Linotype" w:cs="Palatino Linotype"/>
-          <w:color w:val="4A4A4A"/>
-          <w:sz w:val="20"/>
-          <w:szCs w:val="20"/>
-        </w:rPr>
-        <w:t>Senior Frontend Engineer with 20+ years of experience building scalable enterprise web applications, AI-powered interfaces, and data-intensive dashboards for financial services and other large-scale industries.</w:t>
-      </w:r>
-    </w:p>
-    <w:p>
-      <w:pPr>
-        <w:pStyle w:val="divdocumentheading"/>
-        <w:tabs>
-          <w:tab w:val="center" w:pos="10840"/>
-        </w:tabs>
-        <w:spacing w:before="300" w:line="260" w:lineRule="atLeast"/>
-        <w:rPr>
-          <w:rFonts w:ascii="Palatino Linotype" w:eastAsia="Palatino Linotype" w:hAnsi="Palatino Linotype" w:cs="Palatino Linotype"/>
-          <w:color w:val="4A4A4A"/>
-          <w:sz w:val="20"/>
-          <w:szCs w:val="20"/>
-        </w:rPr>
-      </w:pPr>
-      <w:r>
-        <w:rPr>
-          <w:rFonts w:ascii="Palatino Linotype" w:eastAsia="Palatino Linotype" w:hAnsi="Palatino Linotype" w:cs="Palatino Linotype"/>
-          <w:color w:val="4A4A4A"/>
-          <w:sz w:val="20"/>
-          <w:szCs w:val="20"/>
-        </w:rPr>
-        <w:t>Expert in React, Next.js, and TypeScript, with strong experience delivering interactive analytics, chat-driven workflows, and component-based UI systems.</w:t>
-      </w:r>
-    </w:p>
-    <w:p>
-      <w:pPr>
-        <w:pStyle w:val="divdocumentheading"/>
-        <w:tabs>
-          <w:tab w:val="center" w:pos="10840"/>
-        </w:tabs>
-        <w:spacing w:before="300" w:line="260" w:lineRule="atLeast"/>
-        <w:rPr>
-          <w:rFonts w:ascii="Palatino Linotype" w:eastAsia="Palatino Linotype" w:hAnsi="Palatino Linotype" w:cs="Palatino Linotype"/>
-          <w:color w:val="4A4A4A"/>
-          <w:sz w:val="20"/>
-          <w:szCs w:val="20"/>
-        </w:rPr>
-      </w:pPr>
-      <w:r>
-        <w:rPr>
-          <w:rFonts w:ascii="Palatino Linotype" w:eastAsia="Palatino Linotype" w:hAnsi="Palatino Linotype" w:cs="Palatino Linotype"/>
-          <w:color w:val="4A4A4A"/>
-          <w:sz w:val="20"/>
-          <w:szCs w:val="20"/>
-        </w:rPr>
-        <w:t>Proven ability to collaborate with business stakeholders, translate requirements into technical solutions, and deliver production-quality SaaS experiences with strong performance, accessibility, and usability.</w:t>
-      </w:r>
-    </w:p>
-    <w:p>
-      <w:pPr>
-        <w:pStyle w:val="divdocumentheading"/>
-        <w:tabs>
-          <w:tab w:val="center" w:pos="10840"/>
-        </w:tabs>
-        <w:spacing w:before="300" w:line="260" w:lineRule="atLeast"/>
-        <w:rPr>
-          <w:rFonts w:ascii="Palatino Linotype" w:eastAsia="Palatino Linotype" w:hAnsi="Palatino Linotype" w:cs="Palatino Linotype"/>
-          <w:color w:val="4A4A4A"/>
-          <w:sz w:val="20"/>
-          <w:szCs w:val="20"/>
-        </w:rPr>
-      </w:pPr>
-      <w:r>
-        <w:rPr>
-          <w:rFonts w:ascii="Palatino Linotype" w:eastAsia="Palatino Linotype" w:hAnsi="Palatino Linotype" w:cs="Palatino Linotype"/>
-          <w:color w:val="4A4A4A"/>
-          <w:sz w:val="20"/>
-          <w:szCs w:val="20"/>
-        </w:rPr>
-        <w:t>Experienced in AI-assisted development, micro-frontend architecture, and enterprise platform modernization, with a focus on scalable frontend systems and measurable business impact.</w:t>
-      </w:r>
-    </w:p>
-    <w:p>
-      <w:pPr>
-        <w:pStyle w:val="divdocumentheading"/>
-        <w:tabs>
-          <w:tab w:val="center" w:pos="10840"/>
-        </w:tabs>
-        <w:spacing w:before="300" w:line="260" w:lineRule="atLeast"/>
-        <w:rPr>
-          <w:rFonts w:ascii="Palatino Linotype" w:eastAsia="Palatino Linotype" w:hAnsi="Palatino Linotype" w:cs="Palatino Linotype"/>
-          <w:strike/>
-          <w:color w:val="BCBFC3"/>
         </w:rPr>
       </w:pPr>
       <w:r>
@@ -339,7 +278,7 @@
               <w:pStyle w:val="divdocumentulli"/>
               <w:numPr>
                 <w:ilvl w:val="0"/>
-                <w:numId w:val="2"/>
+                <w:numId w:val="1"/>
               </w:numPr>
               <w:spacing w:line="260" w:lineRule="atLeast"/>
               <w:ind w:left="280" w:hanging="192"/>
@@ -353,53 +292,23 @@
             <w:r>
               <w:rPr>
                 <w:rFonts w:ascii="Palatino Linotype" w:eastAsia="Palatino Linotype" w:hAnsi="Palatino Linotype" w:cs="Palatino Linotype"/>
+                <w:color w:val="4A4A4A"/>
+                <w:sz w:val="20"/>
+                <w:szCs w:val="20"/>
+              </w:rPr>
+              <w:t xml:space="preserve">Frontend: </w:t>
+            </w:r>
+            <w:r>
+              <w:rPr>
+                <w:rStyle w:val="Strong1"/>
+                <w:rFonts w:ascii="Palatino Linotype" w:eastAsia="Palatino Linotype" w:hAnsi="Palatino Linotype" w:cs="Palatino Linotype"/>
                 <w:b/>
                 <w:bCs/>
                 <w:color w:val="4A4A4A"/>
                 <w:sz w:val="20"/>
                 <w:szCs w:val="20"/>
               </w:rPr>
-              <w:t>Frontend</w:t>
-            </w:r>
-            <w:r>
-              <w:rPr>
-                <w:rFonts w:ascii="Palatino Linotype" w:eastAsia="Palatino Linotype" w:hAnsi="Palatino Linotype" w:cs="Palatino Linotype"/>
-                <w:b/>
-                <w:bCs/>
-                <w:color w:val="4A4A4A"/>
-                <w:sz w:val="20"/>
-                <w:szCs w:val="20"/>
-              </w:rPr>
-              <w:t xml:space="preserve"> </w:t>
-            </w:r>
-            <w:r>
-              <w:rPr>
-                <w:rFonts w:ascii="Palatino Linotype" w:eastAsia="Palatino Linotype" w:hAnsi="Palatino Linotype" w:cs="Palatino Linotype"/>
-                <w:b/>
-                <w:bCs/>
-                <w:color w:val="4A4A4A"/>
-                <w:sz w:val="20"/>
-                <w:szCs w:val="20"/>
-              </w:rPr>
-              <w:t>Engineering</w:t>
-            </w:r>
-            <w:r>
-              <w:rPr>
-                <w:rFonts w:ascii="Palatino Linotype" w:eastAsia="Palatino Linotype" w:hAnsi="Palatino Linotype" w:cs="Palatino Linotype"/>
-                <w:color w:val="4A4A4A"/>
-                <w:sz w:val="20"/>
-                <w:szCs w:val="20"/>
-              </w:rPr>
-              <w:t xml:space="preserve">: </w:t>
-            </w:r>
-            <w:r>
-              <w:rPr>
-                <w:rFonts w:ascii="Palatino Linotype" w:eastAsia="Palatino Linotype" w:hAnsi="Palatino Linotype" w:cs="Palatino Linotype"/>
-                <w:color w:val="4A4A4A"/>
-                <w:sz w:val="20"/>
-                <w:szCs w:val="20"/>
-              </w:rPr>
-              <w:t>React, Next.js, TypeScript, JavaScript, Redux, Micro-Frontends, Component Libraries, Design Systems</w:t>
+              <w:t>React, TypeScript, Next.js, Redux, Micro-Frontends, Angular, Vue</w:t>
             </w:r>
           </w:p>
           <w:p>
@@ -407,7 +316,7 @@
               <w:pStyle w:val="divdocumentulli"/>
               <w:numPr>
                 <w:ilvl w:val="0"/>
-                <w:numId w:val="2"/>
+                <w:numId w:val="1"/>
               </w:numPr>
               <w:spacing w:line="260" w:lineRule="atLeast"/>
               <w:ind w:left="280" w:hanging="192"/>
@@ -421,33 +330,23 @@
             <w:r>
               <w:rPr>
                 <w:rFonts w:ascii="Palatino Linotype" w:eastAsia="Palatino Linotype" w:hAnsi="Palatino Linotype" w:cs="Palatino Linotype"/>
+                <w:color w:val="4A4A4A"/>
+                <w:sz w:val="20"/>
+                <w:szCs w:val="20"/>
+              </w:rPr>
+              <w:t xml:space="preserve">Build: </w:t>
+            </w:r>
+            <w:r>
+              <w:rPr>
+                <w:rStyle w:val="Strong1"/>
+                <w:rFonts w:ascii="Palatino Linotype" w:eastAsia="Palatino Linotype" w:hAnsi="Palatino Linotype" w:cs="Palatino Linotype"/>
                 <w:b/>
                 <w:bCs/>
                 <w:color w:val="4A4A4A"/>
                 <w:sz w:val="20"/>
                 <w:szCs w:val="20"/>
               </w:rPr>
-              <w:t>Styling / UI Systems</w:t>
-            </w:r>
-            <w:r>
-              <w:rPr>
-                <w:rFonts w:ascii="Palatino Linotype" w:eastAsia="Palatino Linotype" w:hAnsi="Palatino Linotype" w:cs="Palatino Linotype"/>
-                <w:b/>
-                <w:bCs/>
-                <w:color w:val="4A4A4A"/>
-                <w:sz w:val="20"/>
-                <w:szCs w:val="20"/>
-              </w:rPr>
-              <w:t xml:space="preserve">: </w:t>
-            </w:r>
-            <w:r>
-              <w:rPr>
-                <w:rFonts w:ascii="Palatino Linotype" w:eastAsia="Palatino Linotype" w:hAnsi="Palatino Linotype" w:cs="Palatino Linotype"/>
-                <w:color w:val="4A4A4A"/>
-                <w:sz w:val="20"/>
-                <w:szCs w:val="20"/>
-              </w:rPr>
-              <w:t>Tailwind CSS, CSS Modules, Mantine, Chakra UI, Ant Design, Shadcn/UI</w:t>
+              <w:t>Vite, Webpack</w:t>
             </w:r>
           </w:p>
           <w:p>
@@ -455,7 +354,7 @@
               <w:pStyle w:val="divdocumentulli"/>
               <w:numPr>
                 <w:ilvl w:val="0"/>
-                <w:numId w:val="2"/>
+                <w:numId w:val="1"/>
               </w:numPr>
               <w:spacing w:line="260" w:lineRule="atLeast"/>
               <w:ind w:left="280" w:hanging="192"/>
@@ -469,49 +368,23 @@
             <w:r>
               <w:rPr>
                 <w:rFonts w:ascii="Palatino Linotype" w:eastAsia="Palatino Linotype" w:hAnsi="Palatino Linotype" w:cs="Palatino Linotype"/>
+                <w:color w:val="4A4A4A"/>
+                <w:sz w:val="20"/>
+                <w:szCs w:val="20"/>
+              </w:rPr>
+              <w:t xml:space="preserve">Testing: </w:t>
+            </w:r>
+            <w:r>
+              <w:rPr>
+                <w:rStyle w:val="Strong1"/>
+                <w:rFonts w:ascii="Palatino Linotype" w:eastAsia="Palatino Linotype" w:hAnsi="Palatino Linotype" w:cs="Palatino Linotype"/>
                 <w:b/>
                 <w:bCs/>
                 <w:color w:val="4A4A4A"/>
                 <w:sz w:val="20"/>
                 <w:szCs w:val="20"/>
               </w:rPr>
-              <w:t>APIs &amp; Backend</w:t>
-            </w:r>
-            <w:r>
-              <w:rPr>
-                <w:rFonts w:ascii="Palatino Linotype" w:eastAsia="Palatino Linotype" w:hAnsi="Palatino Linotype" w:cs="Palatino Linotype"/>
-                <w:color w:val="4A4A4A"/>
-                <w:sz w:val="20"/>
-                <w:szCs w:val="20"/>
-              </w:rPr>
-              <w:t>:</w:t>
-            </w:r>
-            <w:r>
-              <w:rPr>
-                <w:rFonts w:ascii="Palatino Linotype" w:eastAsia="Palatino Linotype" w:hAnsi="Palatino Linotype" w:cs="Palatino Linotype"/>
-                <w:color w:val="4A4A4A"/>
-                <w:sz w:val="20"/>
-                <w:szCs w:val="20"/>
-              </w:rPr>
-              <w:t xml:space="preserve"> </w:t>
-            </w:r>
-            <w:r>
-              <w:rPr>
-                <w:rFonts w:ascii="Palatino Linotype" w:eastAsia="Palatino Linotype" w:hAnsi="Palatino Linotype" w:cs="Palatino Linotype"/>
-                <w:color w:val="4A4A4A"/>
-                <w:sz w:val="20"/>
-                <w:szCs w:val="20"/>
-              </w:rPr>
-              <w:t>REST, GraphQL, Java, SQL</w:t>
-            </w:r>
-            <w:r>
-              <w:rPr>
-                <w:rFonts w:ascii="Palatino Linotype" w:eastAsia="Palatino Linotype" w:hAnsi="Palatino Linotype" w:cs="Palatino Linotype"/>
-                <w:color w:val="4A4A4A"/>
-                <w:sz w:val="20"/>
-                <w:szCs w:val="20"/>
-              </w:rPr>
-              <w:t xml:space="preserve"> </w:t>
+              <w:t>Jest, RTL, Cypress</w:t>
             </w:r>
           </w:p>
           <w:p>
@@ -519,7 +392,7 @@
               <w:pStyle w:val="divdocumentulli"/>
               <w:numPr>
                 <w:ilvl w:val="0"/>
-                <w:numId w:val="2"/>
+                <w:numId w:val="1"/>
               </w:numPr>
               <w:spacing w:line="260" w:lineRule="atLeast"/>
               <w:ind w:left="280" w:hanging="192"/>
@@ -537,7 +410,135 @@
                 <w:sz w:val="20"/>
                 <w:szCs w:val="20"/>
               </w:rPr>
-              <w:t>Data Visualization: Recharts, D3.js, Chart.js, Interactive Dashboards</w:t>
+              <w:t xml:space="preserve">CI/CD/Cloud: </w:t>
+            </w:r>
+            <w:r>
+              <w:rPr>
+                <w:rStyle w:val="Strong1"/>
+                <w:rFonts w:ascii="Palatino Linotype" w:eastAsia="Palatino Linotype" w:hAnsi="Palatino Linotype" w:cs="Palatino Linotype"/>
+                <w:b/>
+                <w:bCs/>
+                <w:color w:val="4A4A4A"/>
+                <w:sz w:val="20"/>
+                <w:szCs w:val="20"/>
+              </w:rPr>
+              <w:t xml:space="preserve">GitHub Actions, Jenkins, Azure DevOps, AWS </w:t>
+            </w:r>
+            <w:proofErr w:type="spellStart"/>
+            <w:r>
+              <w:rPr>
+                <w:rStyle w:val="Strong1"/>
+                <w:rFonts w:ascii="Palatino Linotype" w:eastAsia="Palatino Linotype" w:hAnsi="Palatino Linotype" w:cs="Palatino Linotype"/>
+                <w:b/>
+                <w:bCs/>
+                <w:color w:val="4A4A4A"/>
+                <w:sz w:val="20"/>
+                <w:szCs w:val="20"/>
+              </w:rPr>
+              <w:t>CodePipeline</w:t>
+            </w:r>
+            <w:proofErr w:type="spellEnd"/>
+            <w:r>
+              <w:rPr>
+                <w:rStyle w:val="Strong1"/>
+                <w:rFonts w:ascii="Palatino Linotype" w:eastAsia="Palatino Linotype" w:hAnsi="Palatino Linotype" w:cs="Palatino Linotype"/>
+                <w:b/>
+                <w:bCs/>
+                <w:color w:val="4A4A4A"/>
+                <w:sz w:val="20"/>
+                <w:szCs w:val="20"/>
+              </w:rPr>
+              <w:t xml:space="preserve">, AWS </w:t>
+            </w:r>
+            <w:proofErr w:type="spellStart"/>
+            <w:r>
+              <w:rPr>
+                <w:rStyle w:val="Strong1"/>
+                <w:rFonts w:ascii="Palatino Linotype" w:eastAsia="Palatino Linotype" w:hAnsi="Palatino Linotype" w:cs="Palatino Linotype"/>
+                <w:b/>
+                <w:bCs/>
+                <w:color w:val="4A4A4A"/>
+                <w:sz w:val="20"/>
+                <w:szCs w:val="20"/>
+              </w:rPr>
+              <w:t>CodeBuild</w:t>
+            </w:r>
+            <w:proofErr w:type="spellEnd"/>
+          </w:p>
+          <w:p>
+            <w:pPr>
+              <w:pStyle w:val="divdocumentulli"/>
+              <w:numPr>
+                <w:ilvl w:val="0"/>
+                <w:numId w:val="1"/>
+              </w:numPr>
+              <w:spacing w:line="260" w:lineRule="atLeast"/>
+              <w:ind w:left="280" w:hanging="192"/>
+              <w:rPr>
+                <w:rFonts w:ascii="Palatino Linotype" w:eastAsia="Palatino Linotype" w:hAnsi="Palatino Linotype" w:cs="Palatino Linotype"/>
+                <w:color w:val="4A4A4A"/>
+                <w:sz w:val="20"/>
+                <w:szCs w:val="20"/>
+              </w:rPr>
+            </w:pPr>
+            <w:r>
+              <w:rPr>
+                <w:rFonts w:ascii="Palatino Linotype" w:eastAsia="Palatino Linotype" w:hAnsi="Palatino Linotype" w:cs="Palatino Linotype"/>
+                <w:color w:val="4A4A4A"/>
+                <w:sz w:val="20"/>
+                <w:szCs w:val="20"/>
+              </w:rPr>
+              <w:t xml:space="preserve">APIs: </w:t>
+            </w:r>
+            <w:r>
+              <w:rPr>
+                <w:rStyle w:val="Strong1"/>
+                <w:rFonts w:ascii="Palatino Linotype" w:eastAsia="Palatino Linotype" w:hAnsi="Palatino Linotype" w:cs="Palatino Linotype"/>
+                <w:b/>
+                <w:bCs/>
+                <w:color w:val="4A4A4A"/>
+                <w:sz w:val="20"/>
+                <w:szCs w:val="20"/>
+              </w:rPr>
+              <w:t>REST, GraphQL</w:t>
+            </w:r>
+          </w:p>
+          <w:p>
+            <w:pPr>
+              <w:pStyle w:val="divdocumentulli"/>
+              <w:numPr>
+                <w:ilvl w:val="0"/>
+                <w:numId w:val="1"/>
+              </w:numPr>
+              <w:spacing w:line="260" w:lineRule="atLeast"/>
+              <w:ind w:left="280" w:hanging="192"/>
+              <w:rPr>
+                <w:rFonts w:ascii="Palatino Linotype" w:eastAsia="Palatino Linotype" w:hAnsi="Palatino Linotype" w:cs="Palatino Linotype"/>
+                <w:color w:val="4A4A4A"/>
+                <w:sz w:val="20"/>
+                <w:szCs w:val="20"/>
+              </w:rPr>
+            </w:pPr>
+            <w:r>
+              <w:rPr>
+                <w:rFonts w:ascii="Palatino Linotype" w:eastAsia="Palatino Linotype" w:hAnsi="Palatino Linotype" w:cs="Palatino Linotype"/>
+                <w:color w:val="4A4A4A"/>
+                <w:sz w:val="20"/>
+                <w:szCs w:val="20"/>
+              </w:rPr>
+              <w:t xml:space="preserve">Cloud: </w:t>
+            </w:r>
+            <w:r>
+              <w:rPr>
+                <w:rStyle w:val="Strong1"/>
+                <w:rFonts w:ascii="Palatino Linotype" w:eastAsia="Palatino Linotype" w:hAnsi="Palatino Linotype" w:cs="Palatino Linotype"/>
+                <w:b/>
+                <w:bCs/>
+                <w:color w:val="4A4A4A"/>
+                <w:sz w:val="20"/>
+                <w:szCs w:val="20"/>
+              </w:rPr>
+              <w:t>AWS, Azure, GCP</w:t>
             </w:r>
           </w:p>
         </w:tc>
@@ -574,31 +575,23 @@
             <w:r>
               <w:rPr>
                 <w:rFonts w:ascii="Palatino Linotype" w:eastAsia="Palatino Linotype" w:hAnsi="Palatino Linotype" w:cs="Palatino Linotype"/>
+                <w:color w:val="4A4A4A"/>
+                <w:sz w:val="20"/>
+                <w:szCs w:val="20"/>
+              </w:rPr>
+              <w:t xml:space="preserve">Backend: </w:t>
+            </w:r>
+            <w:r>
+              <w:rPr>
+                <w:rStyle w:val="Strong1"/>
+                <w:rFonts w:ascii="Palatino Linotype" w:eastAsia="Palatino Linotype" w:hAnsi="Palatino Linotype" w:cs="Palatino Linotype"/>
                 <w:b/>
                 <w:bCs/>
                 <w:color w:val="4A4A4A"/>
                 <w:sz w:val="20"/>
                 <w:szCs w:val="20"/>
               </w:rPr>
-              <w:t>AI-Assisted Development:</w:t>
-            </w:r>
-            <w:r>
-              <w:rPr>
-                <w:rFonts w:ascii="Palatino Linotype" w:eastAsia="Palatino Linotype" w:hAnsi="Palatino Linotype" w:cs="Palatino Linotype"/>
-                <w:color w:val="4A4A4A"/>
-                <w:sz w:val="20"/>
-                <w:szCs w:val="20"/>
-              </w:rPr>
-              <w:t xml:space="preserve"> </w:t>
-            </w:r>
-            <w:r>
-              <w:rPr>
-                <w:rFonts w:ascii="Palatino Linotype" w:eastAsia="Palatino Linotype" w:hAnsi="Palatino Linotype" w:cs="Palatino Linotype"/>
-                <w:color w:val="4A4A4A"/>
-                <w:sz w:val="20"/>
-                <w:szCs w:val="20"/>
-              </w:rPr>
-              <w:t>LLMs, AI-assisted workflows, Copilot-style interfaces, prompt engineering, Sapient Slingshot, GitHub Copilot</w:t>
+              <w:t>Java, SQL</w:t>
             </w:r>
           </w:p>
           <w:p>
@@ -620,49 +613,37 @@
             <w:r>
               <w:rPr>
                 <w:rFonts w:ascii="Palatino Linotype" w:eastAsia="Palatino Linotype" w:hAnsi="Palatino Linotype" w:cs="Palatino Linotype"/>
+                <w:color w:val="4A4A4A"/>
+                <w:sz w:val="20"/>
+                <w:szCs w:val="20"/>
+              </w:rPr>
+              <w:t xml:space="preserve">Performance optimization: </w:t>
+            </w:r>
+            <w:proofErr w:type="spellStart"/>
+            <w:r>
+              <w:rPr>
+                <w:rStyle w:val="Strong1"/>
+                <w:rFonts w:ascii="Palatino Linotype" w:eastAsia="Palatino Linotype" w:hAnsi="Palatino Linotype" w:cs="Palatino Linotype"/>
                 <w:b/>
                 <w:bCs/>
                 <w:color w:val="4A4A4A"/>
                 <w:sz w:val="20"/>
                 <w:szCs w:val="20"/>
               </w:rPr>
-              <w:t>Testing</w:t>
-            </w:r>
-            <w:r>
-              <w:rPr>
-                <w:rFonts w:ascii="Palatino Linotype" w:eastAsia="Palatino Linotype" w:hAnsi="Palatino Linotype" w:cs="Palatino Linotype"/>
-                <w:color w:val="4A4A4A"/>
-                <w:sz w:val="20"/>
-                <w:szCs w:val="20"/>
-              </w:rPr>
-              <w:t xml:space="preserve">: </w:t>
-            </w:r>
-            <w:r>
-              <w:rPr>
-                <w:rFonts w:ascii="Palatino Linotype" w:eastAsia="Palatino Linotype" w:hAnsi="Palatino Linotype" w:cs="Palatino Linotype"/>
-                <w:color w:val="4A4A4A"/>
-                <w:sz w:val="20"/>
-                <w:szCs w:val="20"/>
-              </w:rPr>
-              <w:t xml:space="preserve">Jest, </w:t>
-            </w:r>
-            <w:r>
-              <w:rPr>
-                <w:rFonts w:ascii="Palatino Linotype" w:eastAsia="Palatino Linotype" w:hAnsi="Palatino Linotype" w:cs="Palatino Linotype"/>
-                <w:color w:val="4A4A4A"/>
-                <w:sz w:val="20"/>
-                <w:szCs w:val="20"/>
-              </w:rPr>
-              <w:t>React Testing Library</w:t>
-            </w:r>
-            <w:r>
-              <w:rPr>
-                <w:rFonts w:ascii="Palatino Linotype" w:eastAsia="Palatino Linotype" w:hAnsi="Palatino Linotype" w:cs="Palatino Linotype"/>
-                <w:color w:val="4A4A4A"/>
-                <w:sz w:val="20"/>
-                <w:szCs w:val="20"/>
-              </w:rPr>
-              <w:t>, Cypress</w:t>
+              <w:t>SpeedCurve</w:t>
+            </w:r>
+            <w:proofErr w:type="spellEnd"/>
+            <w:r>
+              <w:rPr>
+                <w:rStyle w:val="Strong1"/>
+                <w:rFonts w:ascii="Palatino Linotype" w:eastAsia="Palatino Linotype" w:hAnsi="Palatino Linotype" w:cs="Palatino Linotype"/>
+                <w:b/>
+                <w:bCs/>
+                <w:color w:val="4A4A4A"/>
+                <w:sz w:val="20"/>
+                <w:szCs w:val="20"/>
+              </w:rPr>
+              <w:t>, Lighthouse</w:t>
             </w:r>
           </w:p>
           <w:p>
@@ -684,41 +665,38 @@
             <w:r>
               <w:rPr>
                 <w:rFonts w:ascii="Palatino Linotype" w:eastAsia="Palatino Linotype" w:hAnsi="Palatino Linotype" w:cs="Palatino Linotype"/>
+                <w:color w:val="4A4A4A"/>
+                <w:sz w:val="20"/>
+                <w:szCs w:val="20"/>
+              </w:rPr>
+              <w:t xml:space="preserve">Accessibility: </w:t>
+            </w:r>
+            <w:r>
+              <w:rPr>
+                <w:rStyle w:val="Strong1"/>
+                <w:rFonts w:ascii="Palatino Linotype" w:eastAsia="Palatino Linotype" w:hAnsi="Palatino Linotype" w:cs="Palatino Linotype"/>
                 <w:b/>
                 <w:bCs/>
                 <w:color w:val="4A4A4A"/>
                 <w:sz w:val="20"/>
                 <w:szCs w:val="20"/>
               </w:rPr>
-              <w:t>Performance &amp; Optimization</w:t>
-            </w:r>
-            <w:r>
-              <w:rPr>
-                <w:rFonts w:ascii="Palatino Linotype" w:eastAsia="Palatino Linotype" w:hAnsi="Palatino Linotype" w:cs="Palatino Linotype"/>
-                <w:color w:val="4A4A4A"/>
-                <w:sz w:val="20"/>
-                <w:szCs w:val="20"/>
-              </w:rPr>
-              <w:t>:</w:t>
-            </w:r>
-            <w:r>
-              <w:rPr>
-                <w:rFonts w:ascii="Palatino Linotype" w:eastAsia="Palatino Linotype" w:hAnsi="Palatino Linotype" w:cs="Palatino Linotype"/>
-                <w:color w:val="4A4A4A"/>
-                <w:sz w:val="20"/>
-                <w:szCs w:val="20"/>
-              </w:rPr>
-              <w:t xml:space="preserve"> </w:t>
-            </w:r>
-            <w:r>
-              <w:rPr>
-                <w:rFonts w:ascii="Palatino Linotype" w:eastAsia="Palatino Linotype" w:hAnsi="Palatino Linotype" w:cs="Palatino Linotype"/>
-                <w:color w:val="4A4A4A"/>
-                <w:sz w:val="20"/>
-                <w:szCs w:val="20"/>
-              </w:rPr>
-              <w:t>Lighthouse, SpeedCurve, Core Web Vitals, WAVE, AudioEye, Responsive Design</w:t>
-            </w:r>
+              <w:t xml:space="preserve">WAVE, </w:t>
+            </w:r>
+            <w:proofErr w:type="spellStart"/>
+            <w:r>
+              <w:rPr>
+                <w:rStyle w:val="Strong1"/>
+                <w:rFonts w:ascii="Palatino Linotype" w:eastAsia="Palatino Linotype" w:hAnsi="Palatino Linotype" w:cs="Palatino Linotype"/>
+                <w:b/>
+                <w:bCs/>
+                <w:color w:val="4A4A4A"/>
+                <w:sz w:val="20"/>
+                <w:szCs w:val="20"/>
+              </w:rPr>
+              <w:t>AudioEye</w:t>
+            </w:r>
+            <w:proofErr w:type="spellEnd"/>
           </w:p>
           <w:p>
             <w:pPr>
@@ -739,31 +717,127 @@
             <w:r>
               <w:rPr>
                 <w:rFonts w:ascii="Palatino Linotype" w:eastAsia="Palatino Linotype" w:hAnsi="Palatino Linotype" w:cs="Palatino Linotype"/>
+                <w:color w:val="4A4A4A"/>
+                <w:sz w:val="20"/>
+                <w:szCs w:val="20"/>
+              </w:rPr>
+              <w:t xml:space="preserve">Design Systems: </w:t>
+            </w:r>
+            <w:proofErr w:type="spellStart"/>
+            <w:r>
+              <w:rPr>
+                <w:rStyle w:val="Strong1"/>
+                <w:rFonts w:ascii="Palatino Linotype" w:eastAsia="Palatino Linotype" w:hAnsi="Palatino Linotype" w:cs="Palatino Linotype"/>
                 <w:b/>
                 <w:bCs/>
                 <w:color w:val="4A4A4A"/>
                 <w:sz w:val="20"/>
                 <w:szCs w:val="20"/>
               </w:rPr>
-              <w:t>Cloud &amp; DevOps</w:t>
-            </w:r>
-            <w:r>
-              <w:rPr>
-                <w:rFonts w:ascii="Palatino Linotype" w:eastAsia="Palatino Linotype" w:hAnsi="Palatino Linotype" w:cs="Palatino Linotype"/>
-                <w:color w:val="4A4A4A"/>
-                <w:sz w:val="20"/>
-                <w:szCs w:val="20"/>
-              </w:rPr>
-              <w:t xml:space="preserve">: </w:t>
-            </w:r>
-            <w:r>
-              <w:rPr>
-                <w:rFonts w:ascii="Palatino Linotype" w:eastAsia="Palatino Linotype" w:hAnsi="Palatino Linotype" w:cs="Palatino Linotype"/>
-                <w:color w:val="4A4A4A"/>
-                <w:sz w:val="20"/>
-                <w:szCs w:val="20"/>
-              </w:rPr>
-              <w:t xml:space="preserve">AWS, Azure, GCP, GitHub Actions, Jenkins </w:t>
+              <w:t>Mantine</w:t>
+            </w:r>
+            <w:proofErr w:type="spellEnd"/>
+            <w:r>
+              <w:rPr>
+                <w:rStyle w:val="Strong1"/>
+                <w:rFonts w:ascii="Palatino Linotype" w:eastAsia="Palatino Linotype" w:hAnsi="Palatino Linotype" w:cs="Palatino Linotype"/>
+                <w:b/>
+                <w:bCs/>
+                <w:color w:val="4A4A4A"/>
+                <w:sz w:val="20"/>
+                <w:szCs w:val="20"/>
+              </w:rPr>
+              <w:t xml:space="preserve">, Chakra UI, Ant Design, </w:t>
+            </w:r>
+            <w:proofErr w:type="spellStart"/>
+            <w:r>
+              <w:rPr>
+                <w:rStyle w:val="Strong1"/>
+                <w:rFonts w:ascii="Palatino Linotype" w:eastAsia="Palatino Linotype" w:hAnsi="Palatino Linotype" w:cs="Palatino Linotype"/>
+                <w:b/>
+                <w:bCs/>
+                <w:color w:val="4A4A4A"/>
+                <w:sz w:val="20"/>
+                <w:szCs w:val="20"/>
+              </w:rPr>
+              <w:t>Shadcn</w:t>
+            </w:r>
+            <w:proofErr w:type="spellEnd"/>
+            <w:r>
+              <w:rPr>
+                <w:rStyle w:val="Strong1"/>
+                <w:rFonts w:ascii="Palatino Linotype" w:eastAsia="Palatino Linotype" w:hAnsi="Palatino Linotype" w:cs="Palatino Linotype"/>
+                <w:b/>
+                <w:bCs/>
+                <w:color w:val="4A4A4A"/>
+                <w:sz w:val="20"/>
+                <w:szCs w:val="20"/>
+              </w:rPr>
+              <w:t>/UI</w:t>
+            </w:r>
+          </w:p>
+          <w:p>
+            <w:pPr>
+              <w:pStyle w:val="divdocumentulli"/>
+              <w:numPr>
+                <w:ilvl w:val="0"/>
+                <w:numId w:val="2"/>
+              </w:numPr>
+              <w:spacing w:line="260" w:lineRule="atLeast"/>
+              <w:ind w:left="280" w:hanging="192"/>
+              <w:rPr>
+                <w:rFonts w:ascii="Palatino Linotype" w:eastAsia="Palatino Linotype" w:hAnsi="Palatino Linotype" w:cs="Palatino Linotype"/>
+                <w:color w:val="4A4A4A"/>
+                <w:sz w:val="20"/>
+                <w:szCs w:val="20"/>
+              </w:rPr>
+            </w:pPr>
+            <w:r>
+              <w:rPr>
+                <w:rFonts w:ascii="Palatino Linotype" w:eastAsia="Palatino Linotype" w:hAnsi="Palatino Linotype" w:cs="Palatino Linotype"/>
+                <w:color w:val="4A4A4A"/>
+                <w:sz w:val="20"/>
+                <w:szCs w:val="20"/>
+              </w:rPr>
+              <w:t>Generative AI</w:t>
+            </w:r>
+            <w:r>
+              <w:rPr>
+                <w:rStyle w:val="Strong1"/>
+                <w:rFonts w:ascii="Palatino Linotype" w:eastAsia="Palatino Linotype" w:hAnsi="Palatino Linotype" w:cs="Palatino Linotype"/>
+                <w:b/>
+                <w:bCs/>
+                <w:color w:val="4A4A4A"/>
+                <w:sz w:val="20"/>
+                <w:szCs w:val="20"/>
+              </w:rPr>
+              <w:t xml:space="preserve">: Sapient Slingshot, </w:t>
+            </w:r>
+            <w:proofErr w:type="spellStart"/>
+            <w:r>
+              <w:rPr>
+                <w:rStyle w:val="Strong1"/>
+                <w:rFonts w:ascii="Palatino Linotype" w:eastAsia="Palatino Linotype" w:hAnsi="Palatino Linotype" w:cs="Palatino Linotype"/>
+                <w:b/>
+                <w:bCs/>
+                <w:color w:val="4A4A4A"/>
+                <w:sz w:val="20"/>
+                <w:szCs w:val="20"/>
+              </w:rPr>
+              <w:t>Github</w:t>
+            </w:r>
+            <w:proofErr w:type="spellEnd"/>
+            <w:r>
+              <w:rPr>
+                <w:rStyle w:val="Strong1"/>
+                <w:rFonts w:ascii="Palatino Linotype" w:eastAsia="Palatino Linotype" w:hAnsi="Palatino Linotype" w:cs="Palatino Linotype"/>
+                <w:b/>
+                <w:bCs/>
+                <w:color w:val="4A4A4A"/>
+                <w:sz w:val="20"/>
+                <w:szCs w:val="20"/>
+              </w:rPr>
+              <w:t xml:space="preserve"> Copilot, Codex, Figma and Jira MCP servers</w:t>
             </w:r>
           </w:p>
         </w:tc>
@@ -778,11 +852,12 @@
         <w:tabs>
           <w:tab w:val="center" w:pos="10840"/>
         </w:tabs>
-        <w:spacing w:before="200" w:after="200" w:line="260" w:lineRule="atLeast"/>
-        <w:rPr>
-          <w:rFonts w:ascii="Palatino Linotype" w:eastAsia="Palatino Linotype" w:hAnsi="Palatino Linotype" w:cs="Palatino Linotype"/>
-          <w:strike/>
-          <w:color w:val="BCBFC3"/>
+        <w:spacing w:before="300" w:line="260" w:lineRule="atLeast"/>
+        <w:rPr>
+          <w:rFonts w:ascii="Palatino Linotype" w:eastAsia="Palatino Linotype" w:hAnsi="Palatino Linotype" w:cs="Palatino Linotype"/>
+          <w:color w:val="4A4A4A"/>
+          <w:sz w:val="20"/>
+          <w:szCs w:val="20"/>
         </w:rPr>
       </w:pPr>
       <w:r>
@@ -813,258 +888,19 @@
       <w:tblPr>
         <w:tblStyle w:val="divdocumentdivparagraphTable"/>
         <w:tblW w:w="0" w:type="auto"/>
-        <w:tblInd w:w="108" w:type="dxa"/>
+        <w:tblCellSpacing w:w="0" w:type="dxa"/>
         <w:tblLayout w:type="fixed"/>
-        <w:tblLook w:val="04A0" w:firstRow="1" w:lastRow="0" w:firstColumn="1" w:lastColumn="0" w:noHBand="0" w:noVBand="1"/>
+        <w:tblCellMar>
+          <w:left w:w="0" w:type="dxa"/>
+          <w:right w:w="0" w:type="dxa"/>
+        </w:tblCellMar>
+        <w:tblLook w:val="05E0" w:firstRow="1" w:lastRow="1" w:firstColumn="1" w:lastColumn="1" w:noHBand="0" w:noVBand="1"/>
       </w:tblPr>
       <w:tblGrid>
         <w:gridCol w:w="3880"/>
         <w:gridCol w:w="6960"/>
       </w:tblGrid>
       <w:tr>
-        <w:tc>
-          <w:tcPr>
-            <w:tcW w:w="3880" w:type="dxa"/>
-            <w:hideMark/>
-          </w:tcPr>
-          <w:p>
-            <w:pPr>
-              <w:pStyle w:val="spanpaddedline"/>
-              <w:spacing w:line="260" w:lineRule="atLeast"/>
-              <w:rPr>
-                <w:rStyle w:val="jobtitle"/>
-                <w:rFonts w:ascii="Palatino Linotype" w:eastAsia="Palatino Linotype" w:hAnsi="Palatino Linotype" w:cs="Palatino Linotype"/>
-                <w:b w:val="0"/>
-                <w:bCs w:val="0"/>
-                <w:color w:val="4A4A4A"/>
-                <w:sz w:val="20"/>
-                <w:szCs w:val="20"/>
-              </w:rPr>
-            </w:pPr>
-            <w:r>
-              <w:rPr>
-                <w:rStyle w:val="span"/>
-                <w:rFonts w:ascii="Palatino Linotype" w:eastAsia="Palatino Linotype" w:hAnsi="Palatino Linotype" w:cs="Palatino Linotype"/>
-                <w:color w:val="4A4A4A"/>
-                <w:sz w:val="20"/>
-                <w:szCs w:val="20"/>
-              </w:rPr>
-              <w:t>Publicis Sapient | Irvine, California</w:t>
-            </w:r>
-          </w:p>
-          <w:p>
-            <w:pPr>
-              <w:pStyle w:val="spanpaddedline"/>
-              <w:spacing w:line="260" w:lineRule="atLeast"/>
-              <w:rPr>
-                <w:rStyle w:val="spandateswrapper"/>
-                <w:rFonts w:ascii="Palatino Linotype" w:eastAsia="Palatino Linotype" w:hAnsi="Palatino Linotype" w:cs="Palatino Linotype"/>
-                <w:i/>
-                <w:iCs/>
-                <w:color w:val="4A4A4A"/>
-                <w:sz w:val="20"/>
-                <w:szCs w:val="20"/>
-              </w:rPr>
-            </w:pPr>
-            <w:r>
-              <w:rPr>
-                <w:rStyle w:val="jobtitle"/>
-                <w:rFonts w:ascii="Palatino Linotype" w:eastAsia="Palatino Linotype" w:hAnsi="Palatino Linotype" w:cs="Palatino Linotype"/>
-                <w:color w:val="4A4A4A"/>
-                <w:sz w:val="20"/>
-                <w:szCs w:val="20"/>
-              </w:rPr>
-              <w:t>AI Product UI Engineering | GMR Platform</w:t>
-            </w:r>
-            <w:r>
-              <w:rPr>
-                <w:rStyle w:val="jobtitle"/>
-                <w:rFonts w:ascii="Palatino Linotype" w:eastAsia="Palatino Linotype" w:hAnsi="Palatino Linotype" w:cs="Palatino Linotype"/>
-                <w:color w:val="4A4A4A"/>
-                <w:sz w:val="20"/>
-                <w:szCs w:val="20"/>
-              </w:rPr>
-              <w:br/>
-            </w:r>
-            <w:r>
-              <w:rPr>
-                <w:rStyle w:val="jobtitle"/>
-                <w:rFonts w:ascii="Palatino Linotype" w:eastAsia="Palatino Linotype" w:hAnsi="Palatino Linotype" w:cs="Palatino Linotype"/>
-                <w:color w:val="4A4A4A"/>
-                <w:sz w:val="20"/>
-                <w:szCs w:val="20"/>
-              </w:rPr>
-              <w:t xml:space="preserve">– </w:t>
-            </w:r>
-            <w:r>
-              <w:rPr>
-                <w:rStyle w:val="jobtitle"/>
-                <w:rFonts w:ascii="Palatino Linotype" w:eastAsia="Palatino Linotype" w:hAnsi="Palatino Linotype" w:cs="Palatino Linotype"/>
-                <w:i/>
-                <w:iCs/>
-                <w:color w:val="4A4A4A"/>
-                <w:sz w:val="18"/>
-                <w:szCs w:val="18"/>
-              </w:rPr>
-              <w:t>Current Project</w:t>
-            </w:r>
-          </w:p>
-        </w:tc>
-        <w:tc>
-          <w:tcPr>
-            <w:tcW w:w="6960" w:type="dxa"/>
-            <w:hideMark/>
-          </w:tcPr>
-          <w:p>
-            <w:pPr>
-              <w:pStyle w:val="divdocumentparlrColmnsinglecolumnulli"/>
-              <w:numPr>
-                <w:ilvl w:val="0"/>
-                <w:numId w:val="3"/>
-              </w:numPr>
-              <w:spacing w:line="260" w:lineRule="atLeast"/>
-              <w:ind w:left="280" w:hanging="192"/>
-              <w:rPr>
-                <w:rStyle w:val="span"/>
-                <w:rFonts w:ascii="Palatino Linotype" w:eastAsia="Palatino Linotype" w:hAnsi="Palatino Linotype" w:cs="Palatino Linotype"/>
-                <w:color w:val="4A4A4A"/>
-                <w:sz w:val="20"/>
-                <w:szCs w:val="20"/>
-              </w:rPr>
-            </w:pPr>
-            <w:r>
-              <w:rPr>
-                <w:rStyle w:val="span"/>
-                <w:rFonts w:ascii="Palatino Linotype" w:eastAsia="Palatino Linotype" w:hAnsi="Palatino Linotype" w:cs="Palatino Linotype"/>
-                <w:color w:val="4A4A4A"/>
-                <w:sz w:val="20"/>
-                <w:szCs w:val="20"/>
-              </w:rPr>
-              <w:t>Partnering with stakeholders and platform teams to identify workflow friction, translate business needs into technical solutions, and shape AI-driven frontend experiences for enterprise support use cases.</w:t>
-            </w:r>
-          </w:p>
-          <w:p>
-            <w:pPr>
-              <w:pStyle w:val="divdocumentparlrColmnsinglecolumnulli"/>
-              <w:numPr>
-                <w:ilvl w:val="0"/>
-                <w:numId w:val="3"/>
-              </w:numPr>
-              <w:spacing w:line="260" w:lineRule="atLeast"/>
-              <w:ind w:left="280" w:hanging="192"/>
-              <w:rPr>
-                <w:rStyle w:val="span"/>
-                <w:rFonts w:ascii="Palatino Linotype" w:eastAsia="Palatino Linotype" w:hAnsi="Palatino Linotype" w:cs="Palatino Linotype"/>
-                <w:color w:val="4A4A4A"/>
-                <w:sz w:val="20"/>
-                <w:szCs w:val="20"/>
-              </w:rPr>
-            </w:pPr>
-            <w:r>
-              <w:rPr>
-                <w:rStyle w:val="span"/>
-                <w:rFonts w:ascii="Palatino Linotype" w:eastAsia="Palatino Linotype" w:hAnsi="Palatino Linotype" w:cs="Palatino Linotype"/>
-                <w:color w:val="4A4A4A"/>
-                <w:sz w:val="20"/>
-                <w:szCs w:val="20"/>
-              </w:rPr>
-              <w:t>Designed and built AI-powered user interfaces, including chat-driven workflows and copilot-style experiences, to improve user efficiency and reduce reliance on manual troubleshooting.</w:t>
-            </w:r>
-          </w:p>
-          <w:p>
-            <w:pPr>
-              <w:pStyle w:val="divdocumentparlrColmnsinglecolumnulli"/>
-              <w:numPr>
-                <w:ilvl w:val="0"/>
-                <w:numId w:val="3"/>
-              </w:numPr>
-              <w:spacing w:line="260" w:lineRule="atLeast"/>
-              <w:ind w:left="280" w:hanging="192"/>
-              <w:rPr>
-                <w:rStyle w:val="span"/>
-                <w:rFonts w:ascii="Palatino Linotype" w:eastAsia="Palatino Linotype" w:hAnsi="Palatino Linotype" w:cs="Palatino Linotype"/>
-                <w:color w:val="4A4A4A"/>
-                <w:sz w:val="20"/>
-                <w:szCs w:val="20"/>
-              </w:rPr>
-            </w:pPr>
-            <w:r>
-              <w:rPr>
-                <w:rStyle w:val="span"/>
-                <w:rFonts w:ascii="Palatino Linotype" w:eastAsia="Palatino Linotype" w:hAnsi="Palatino Linotype" w:cs="Palatino Linotype"/>
-                <w:color w:val="4A4A4A"/>
-                <w:sz w:val="20"/>
-                <w:szCs w:val="20"/>
-              </w:rPr>
-              <w:t>Built interactive analytics dashboards and visualization layers using Recharts and D3.js, enabling users to analyze complex data and make faster, data-driven decisions.</w:t>
-            </w:r>
-          </w:p>
-          <w:p>
-            <w:pPr>
-              <w:pStyle w:val="divdocumentparlrColmnsinglecolumnulli"/>
-              <w:numPr>
-                <w:ilvl w:val="0"/>
-                <w:numId w:val="3"/>
-              </w:numPr>
-              <w:spacing w:line="260" w:lineRule="atLeast"/>
-              <w:ind w:left="280" w:hanging="192"/>
-              <w:rPr>
-                <w:rStyle w:val="span"/>
-                <w:rFonts w:ascii="Palatino Linotype" w:eastAsia="Palatino Linotype" w:hAnsi="Palatino Linotype" w:cs="Palatino Linotype"/>
-                <w:color w:val="4A4A4A"/>
-                <w:sz w:val="20"/>
-                <w:szCs w:val="20"/>
-              </w:rPr>
-            </w:pPr>
-            <w:r>
-              <w:rPr>
-                <w:rStyle w:val="span"/>
-                <w:rFonts w:ascii="Palatino Linotype" w:eastAsia="Palatino Linotype" w:hAnsi="Palatino Linotype" w:cs="Palatino Linotype"/>
-                <w:color w:val="4A4A4A"/>
-                <w:sz w:val="20"/>
-                <w:szCs w:val="20"/>
-              </w:rPr>
-              <w:t>Drove adoption of AI-assisted development workflows using Sapient Slingshot and automated code-generation approaches, reducing UI development effort by ~30% and accelerating delivery cycles.</w:t>
-            </w:r>
-          </w:p>
-          <w:p>
-            <w:pPr>
-              <w:pStyle w:val="divdocumentparlrColmnsinglecolumnulli"/>
-              <w:numPr>
-                <w:ilvl w:val="0"/>
-                <w:numId w:val="3"/>
-              </w:numPr>
-              <w:spacing w:line="260" w:lineRule="atLeast"/>
-              <w:ind w:left="280" w:hanging="192"/>
-              <w:rPr>
-                <w:rStyle w:val="span"/>
-                <w:rFonts w:ascii="Palatino Linotype" w:eastAsia="Palatino Linotype" w:hAnsi="Palatino Linotype" w:cs="Palatino Linotype"/>
-                <w:color w:val="4A4A4A"/>
-                <w:sz w:val="20"/>
-                <w:szCs w:val="20"/>
-              </w:rPr>
-            </w:pPr>
-            <w:r>
-              <w:rPr>
-                <w:rFonts w:ascii="Palatino Linotype" w:eastAsia="Palatino Linotype" w:hAnsi="Palatino Linotype" w:cs="Palatino Linotype"/>
-                <w:color w:val="4A4A4A"/>
-                <w:sz w:val="20"/>
-                <w:szCs w:val="20"/>
-              </w:rPr>
-              <w:t>Presented working solutions and interactive demos to stakeholders, helping communicate complex AI concepts, influence product direction, and align technical solutions with business needs.</w:t>
-            </w:r>
-          </w:p>
-        </w:tc>
-      </w:tr>
-      <w:tr>
-        <w:tblPrEx>
-          <w:tblCellSpacing w:w="0" w:type="dxa"/>
-          <w:tblCellMar>
-            <w:left w:w="0" w:type="dxa"/>
-            <w:right w:w="0" w:type="dxa"/>
-          </w:tblCellMar>
-          <w:tblLook w:val="05E0" w:firstRow="1" w:lastRow="1" w:firstColumn="1" w:lastColumn="1" w:noHBand="0" w:noVBand="1"/>
-        </w:tblPrEx>
         <w:trPr>
           <w:tblCellSpacing w:w="0" w:type="dxa"/>
         </w:trPr>
@@ -1084,19 +920,6 @@
               <w:pStyle w:val="spanpaddedline"/>
               <w:spacing w:line="260" w:lineRule="atLeast"/>
               <w:rPr>
-                <w:rStyle w:val="span"/>
-                <w:rFonts w:ascii="Palatino Linotype" w:eastAsia="Palatino Linotype" w:hAnsi="Palatino Linotype" w:cs="Palatino Linotype"/>
-                <w:color w:val="4A4A4A"/>
-                <w:sz w:val="20"/>
-                <w:szCs w:val="20"/>
-              </w:rPr>
-            </w:pPr>
-          </w:p>
-          <w:p>
-            <w:pPr>
-              <w:pStyle w:val="spanpaddedline"/>
-              <w:spacing w:line="260" w:lineRule="atLeast"/>
-              <w:rPr>
                 <w:rStyle w:val="spandateswrapper"/>
                 <w:rFonts w:ascii="Palatino Linotype" w:eastAsia="Palatino Linotype" w:hAnsi="Palatino Linotype" w:cs="Palatino Linotype"/>
                 <w:color w:val="4A4A4A"/>
@@ -1204,7 +1027,12 @@
           <w:p>
             <w:pPr>
               <w:pStyle w:val="divdocumentparlrColmnsinglecolumnulli"/>
+              <w:numPr>
+                <w:ilvl w:val="0"/>
+                <w:numId w:val="3"/>
+              </w:numPr>
               <w:spacing w:line="260" w:lineRule="atLeast"/>
+              <w:ind w:left="280" w:hanging="192"/>
               <w:rPr>
                 <w:rStyle w:val="span"/>
                 <w:rFonts w:ascii="Palatino Linotype" w:eastAsia="Palatino Linotype" w:hAnsi="Palatino Linotype" w:cs="Palatino Linotype"/>
@@ -1213,6 +1041,38 @@
                 <w:szCs w:val="20"/>
               </w:rPr>
             </w:pPr>
+            <w:r>
+              <w:rPr>
+                <w:rStyle w:val="span"/>
+                <w:rFonts w:ascii="Palatino Linotype" w:eastAsia="Palatino Linotype" w:hAnsi="Palatino Linotype" w:cs="Palatino Linotype"/>
+                <w:color w:val="4A4A4A"/>
+                <w:sz w:val="20"/>
+                <w:szCs w:val="20"/>
+              </w:rPr>
+              <w:t>Led technical architecture for a Fortune 500 telecommunications platform, modernizing legacy systems into micro-frontend-based applications using React and TypeScript, enabling independent deployments across 6+ teams and supporting a multi-</w:t>
+            </w:r>
+            <w:proofErr w:type="gramStart"/>
+            <w:r>
+              <w:rPr>
+                <w:rStyle w:val="span"/>
+                <w:rFonts w:ascii="Palatino Linotype" w:eastAsia="Palatino Linotype" w:hAnsi="Palatino Linotype" w:cs="Palatino Linotype"/>
+                <w:color w:val="4A4A4A"/>
+                <w:sz w:val="20"/>
+                <w:szCs w:val="20"/>
+              </w:rPr>
+              <w:t>million dollar</w:t>
+            </w:r>
+            <w:proofErr w:type="gramEnd"/>
+            <w:r>
+              <w:rPr>
+                <w:rStyle w:val="span"/>
+                <w:rFonts w:ascii="Palatino Linotype" w:eastAsia="Palatino Linotype" w:hAnsi="Palatino Linotype" w:cs="Palatino Linotype"/>
+                <w:color w:val="4A4A4A"/>
+                <w:sz w:val="20"/>
+                <w:szCs w:val="20"/>
+              </w:rPr>
+              <w:t xml:space="preserve"> digital channel.</w:t>
+            </w:r>
           </w:p>
           <w:p>
             <w:pPr>
@@ -1239,7 +1099,7 @@
                 <w:sz w:val="20"/>
                 <w:szCs w:val="20"/>
               </w:rPr>
-              <w:t>Led architecture and development of modular web applications for Fortune 500 clients, supporting scalable, high-traffic enterprise platforms across multiple teams.</w:t>
+              <w:t>Architected a digital commerce platform for a large retail enterprise, building scalable vendor and merchant workflows using React, Next.js, and GraphQL, supporting $10M+ in annual transaction volume.</w:t>
             </w:r>
           </w:p>
           <w:p>
@@ -1267,8 +1127,7 @@
                 <w:sz w:val="20"/>
                 <w:szCs w:val="20"/>
               </w:rPr>
-              <w:lastRenderedPageBreak/>
-              <w:t>Delivered data-intensive UI solutions for financial services clients including Capital Group, Franklin Templeton, Empower, and Citigroup, building scalable dashboards and analytics interfaces using Recharts and D3.js.</w:t>
+              <w:t>Delivered AI-powered content and collaboration platform integrating LLMs and modern frontend frameworks, enhancing team productivity and streamlining manual workflows.</w:t>
             </w:r>
           </w:p>
           <w:p>
@@ -1282,6 +1141,8 @@
               <w:ind w:left="280" w:hanging="192"/>
               <w:rPr>
                 <w:rStyle w:val="span"/>
+                <w:rFonts w:ascii="Palatino Linotype" w:eastAsia="Palatino Linotype" w:hAnsi="Palatino Linotype" w:cs="Palatino Linotype"/>
+                <w:color w:val="4A4A4A"/>
                 <w:sz w:val="20"/>
                 <w:szCs w:val="20"/>
               </w:rPr>
@@ -1294,7 +1155,7 @@
                 <w:sz w:val="20"/>
                 <w:szCs w:val="20"/>
               </w:rPr>
-              <w:t>Partnered with business stakeholders, product teams, and engineers to gather requirements, translate workflows into technical specifications, and define scalable frontend and platform solutions aligned to business objectives.</w:t>
+              <w:t>Directed performance optimization for high-traffic applications, reducing page load time by ~20% and improving user engagement.</w:t>
             </w:r>
           </w:p>
           <w:p>
@@ -1322,7 +1183,7 @@
                 <w:sz w:val="20"/>
                 <w:szCs w:val="20"/>
               </w:rPr>
-              <w:t>Translated Figma and product designs into scalable, production-ready interfaces aligned with usability, accessibility, and business requirements.</w:t>
+              <w:t>Standardized CI/CD pipelines with GitHub Actions and Jenkins, increasing deployment speed by ~30% and ensuring reliable releases.</w:t>
             </w:r>
           </w:p>
           <w:p>
@@ -1350,7 +1211,7 @@
                 <w:sz w:val="20"/>
                 <w:szCs w:val="20"/>
               </w:rPr>
-              <w:t>Built configurable dashboard and analytics interfaces using reusable visualization patterns to support different business workflows and reporting needs.</w:t>
+              <w:t>Built reusable UI platforms and component libraries, accelerating feature delivery by ~25% and ensuring consistency.</w:t>
             </w:r>
           </w:p>
           <w:p>
@@ -1378,7 +1239,7 @@
                 <w:sz w:val="20"/>
                 <w:szCs w:val="20"/>
               </w:rPr>
-              <w:t>Contributed to reusable component libraries, internal documentation, and cross-team knowledge sharing to support consistent delivery across distributed teams.</w:t>
+              <w:t>Established testing strategies using Jest, RTL, and Cypress, improving release confidence and reducing production defects.</w:t>
             </w:r>
           </w:p>
           <w:p>
@@ -1406,119 +1267,7 @@
                 <w:sz w:val="20"/>
                 <w:szCs w:val="20"/>
               </w:rPr>
-              <w:t>Designed AI-driven user experiences leveraging LLMs for intelligent workflows, dynamic response generation, and more intuitive user interaction patterns.</w:t>
-            </w:r>
-          </w:p>
-          <w:p>
-            <w:pPr>
-              <w:pStyle w:val="divdocumentparlrColmnsinglecolumnulli"/>
-              <w:numPr>
-                <w:ilvl w:val="0"/>
-                <w:numId w:val="3"/>
-              </w:numPr>
-              <w:spacing w:line="260" w:lineRule="atLeast"/>
-              <w:ind w:left="280" w:hanging="192"/>
-              <w:rPr>
-                <w:rStyle w:val="span"/>
-                <w:rFonts w:ascii="Palatino Linotype" w:eastAsia="Palatino Linotype" w:hAnsi="Palatino Linotype" w:cs="Palatino Linotype"/>
-                <w:color w:val="4A4A4A"/>
-                <w:sz w:val="20"/>
-                <w:szCs w:val="20"/>
-              </w:rPr>
-            </w:pPr>
-            <w:r>
-              <w:rPr>
-                <w:rStyle w:val="span"/>
-                <w:rFonts w:ascii="Palatino Linotype" w:eastAsia="Palatino Linotype" w:hAnsi="Palatino Linotype" w:cs="Palatino Linotype"/>
-                <w:color w:val="4A4A4A"/>
-                <w:sz w:val="20"/>
-                <w:szCs w:val="20"/>
-              </w:rPr>
-              <w:t>Owned end-to-end feature development from concept and design handoff through implementation and delivery.</w:t>
-            </w:r>
-          </w:p>
-          <w:p>
-            <w:pPr>
-              <w:pStyle w:val="divdocumentparlrColmnsinglecolumnulli"/>
-              <w:numPr>
-                <w:ilvl w:val="0"/>
-                <w:numId w:val="3"/>
-              </w:numPr>
-              <w:spacing w:line="260" w:lineRule="atLeast"/>
-              <w:ind w:left="280" w:hanging="192"/>
-              <w:rPr>
-                <w:rStyle w:val="span"/>
-                <w:rFonts w:ascii="Palatino Linotype" w:eastAsia="Palatino Linotype" w:hAnsi="Palatino Linotype" w:cs="Palatino Linotype"/>
-                <w:color w:val="4A4A4A"/>
-                <w:sz w:val="20"/>
-                <w:szCs w:val="20"/>
-              </w:rPr>
-            </w:pPr>
-            <w:r>
-              <w:rPr>
-                <w:rStyle w:val="span"/>
-                <w:rFonts w:ascii="Palatino Linotype" w:eastAsia="Palatino Linotype" w:hAnsi="Palatino Linotype" w:cs="Palatino Linotype"/>
-                <w:color w:val="4A4A4A"/>
-                <w:sz w:val="20"/>
-                <w:szCs w:val="20"/>
-              </w:rPr>
-              <w:t>Optimized web application performance, reducing page load times by ~20% and improving overall user experience quality.</w:t>
-            </w:r>
-          </w:p>
-          <w:p>
-            <w:pPr>
-              <w:pStyle w:val="divdocumentparlrColmnsinglecolumnulli"/>
-              <w:numPr>
-                <w:ilvl w:val="0"/>
-                <w:numId w:val="3"/>
-              </w:numPr>
-              <w:spacing w:line="260" w:lineRule="atLeast"/>
-              <w:ind w:left="280" w:hanging="192"/>
-              <w:rPr>
-                <w:rStyle w:val="span"/>
-                <w:rFonts w:ascii="Palatino Linotype" w:eastAsia="Palatino Linotype" w:hAnsi="Palatino Linotype" w:cs="Palatino Linotype"/>
-                <w:color w:val="4A4A4A"/>
-                <w:sz w:val="20"/>
-                <w:szCs w:val="20"/>
-              </w:rPr>
-            </w:pPr>
-            <w:r>
-              <w:rPr>
-                <w:rStyle w:val="span"/>
-                <w:rFonts w:ascii="Palatino Linotype" w:eastAsia="Palatino Linotype" w:hAnsi="Palatino Linotype" w:cs="Palatino Linotype"/>
-                <w:color w:val="4A4A4A"/>
-                <w:sz w:val="20"/>
-                <w:szCs w:val="20"/>
-              </w:rPr>
-              <w:t>Built scalable design systems to improve UI consistency, accelerate delivery, and support maintainable frontend development across teams.</w:t>
-            </w:r>
-          </w:p>
-          <w:p>
-            <w:pPr>
-              <w:pStyle w:val="divdocumentparlrColmnsinglecolumnulli"/>
-              <w:numPr>
-                <w:ilvl w:val="0"/>
-                <w:numId w:val="3"/>
-              </w:numPr>
-              <w:spacing w:line="260" w:lineRule="atLeast"/>
-              <w:ind w:left="280" w:hanging="192"/>
-              <w:rPr>
-                <w:rStyle w:val="span"/>
-                <w:rFonts w:ascii="Palatino Linotype" w:eastAsia="Palatino Linotype" w:hAnsi="Palatino Linotype" w:cs="Palatino Linotype"/>
-                <w:color w:val="4A4A4A"/>
-                <w:sz w:val="20"/>
-                <w:szCs w:val="20"/>
-              </w:rPr>
-            </w:pPr>
-            <w:r>
-              <w:rPr>
-                <w:rStyle w:val="span"/>
-                <w:rFonts w:ascii="Palatino Linotype" w:eastAsia="Palatino Linotype" w:hAnsi="Palatino Linotype" w:cs="Palatino Linotype"/>
-                <w:color w:val="4A4A4A"/>
-                <w:sz w:val="20"/>
-                <w:szCs w:val="20"/>
-              </w:rPr>
-              <w:t>Led cross-functional collaboration across engineering, product, and design, aligning technical execution with product goals and roadmap direction.</w:t>
+              <w:t>Led and mentored engineering teams, improving code quality and adoption of architecture standards.</w:t>
             </w:r>
           </w:p>
         </w:tc>
@@ -1696,7 +1445,7 @@
                 <w:sz w:val="20"/>
                 <w:szCs w:val="20"/>
               </w:rPr>
-              <w:t>Led frontend development for a financial services platform, building scalable single-page applications that improved usability, responsiveness, and overall performance.</w:t>
+              <w:t>Led frontend development for a financial services platform, building scalable SPA applications improving performance and usability.</w:t>
             </w:r>
           </w:p>
           <w:p>
@@ -1724,7 +1473,7 @@
                 <w:sz w:val="20"/>
                 <w:szCs w:val="20"/>
               </w:rPr>
-              <w:t>Integrated frontend applications with backend services and enterprise systems, supporting operational workflows and business-critical functionality.</w:t>
+              <w:t>Developed accessible UI components and design systems improving consistency and usability across applications.</w:t>
             </w:r>
           </w:p>
           <w:p>
@@ -1752,7 +1501,18 @@
                 <w:sz w:val="20"/>
                 <w:szCs w:val="20"/>
               </w:rPr>
-              <w:t>Improved accessibility and consistency across applications by implementing reusable UI patterns and adhering to accessibility standards.</w:t>
+              <w:t xml:space="preserve">Contributed to enterprise systems using modern JavaScript frameworks, </w:t>
+            </w:r>
+            <w:r>
+              <w:rPr>
+                <w:rStyle w:val="span"/>
+                <w:rFonts w:ascii="Palatino Linotype" w:eastAsia="Palatino Linotype" w:hAnsi="Palatino Linotype" w:cs="Palatino Linotype"/>
+                <w:color w:val="4A4A4A"/>
+                <w:sz w:val="20"/>
+                <w:szCs w:val="20"/>
+              </w:rPr>
+              <w:lastRenderedPageBreak/>
+              <w:t>improving operational workflows.</w:t>
             </w:r>
           </w:p>
           <w:p>
@@ -1780,7 +1540,7 @@
                 <w:sz w:val="20"/>
                 <w:szCs w:val="20"/>
               </w:rPr>
-              <w:t>Introduced testing and CI/CD practices that improved release quality and reduced regression issues.</w:t>
+              <w:t>Introduced CI/CD and testing practices improving delivery quality and reducing regression issues.</w:t>
             </w:r>
           </w:p>
           <w:p>
@@ -1802,12 +1562,13 @@
             </w:pPr>
             <w:r>
               <w:rPr>
-                <w:rFonts w:ascii="Palatino Linotype" w:eastAsia="Palatino Linotype" w:hAnsi="Palatino Linotype" w:cs="Palatino Linotype"/>
-                <w:color w:val="4A4A4A"/>
-                <w:sz w:val="20"/>
-                <w:szCs w:val="20"/>
-              </w:rPr>
-              <w:t>Partnered with design teams to translate product and UX designs into high-quality, production-ready interfaces.</w:t>
+                <w:rStyle w:val="span"/>
+                <w:rFonts w:ascii="Palatino Linotype" w:eastAsia="Palatino Linotype" w:hAnsi="Palatino Linotype" w:cs="Palatino Linotype"/>
+                <w:color w:val="4A4A4A"/>
+                <w:sz w:val="20"/>
+                <w:szCs w:val="20"/>
+              </w:rPr>
+              <w:t>Contributed to backend services and integrations using Java and SQL.</w:t>
             </w:r>
           </w:p>
         </w:tc>
@@ -1965,7 +1726,7 @@
               <w:pStyle w:val="divdocumentparlrColmnsinglecolumnulli"/>
               <w:numPr>
                 <w:ilvl w:val="0"/>
-                <w:numId w:val="4"/>
+                <w:numId w:val="5"/>
               </w:numPr>
               <w:spacing w:line="260" w:lineRule="atLeast"/>
               <w:ind w:left="280" w:hanging="192"/>
@@ -1985,7 +1746,7 @@
                 <w:sz w:val="20"/>
                 <w:szCs w:val="20"/>
               </w:rPr>
-              <w:t>Developed financial dashboards and data visualization tools using D3.js and other charting libraries, enabling stakeholders to interpret investment data and make informed decisions.</w:t>
+              <w:t>Built data visualization tools that empowered stakeholders to analyze business data effectively.</w:t>
             </w:r>
           </w:p>
           <w:p>
@@ -1993,7 +1754,7 @@
               <w:pStyle w:val="divdocumentparlrColmnsinglecolumnulli"/>
               <w:numPr>
                 <w:ilvl w:val="0"/>
-                <w:numId w:val="4"/>
+                <w:numId w:val="5"/>
               </w:numPr>
               <w:spacing w:line="260" w:lineRule="atLeast"/>
               <w:ind w:left="280" w:hanging="192"/>
@@ -2013,7 +1774,7 @@
                 <w:sz w:val="20"/>
                 <w:szCs w:val="20"/>
               </w:rPr>
-              <w:t>Built financial applications and reporting interfaces that improved data visibility and supported business decision-making.</w:t>
+              <w:t>Translated business requirements into scalable technical solutions.</w:t>
             </w:r>
           </w:p>
           <w:p>
@@ -2021,7 +1782,7 @@
               <w:pStyle w:val="divdocumentparlrColmnsinglecolumnulli"/>
               <w:numPr>
                 <w:ilvl w:val="0"/>
-                <w:numId w:val="4"/>
+                <w:numId w:val="5"/>
               </w:numPr>
               <w:spacing w:line="260" w:lineRule="atLeast"/>
               <w:ind w:left="280" w:hanging="192"/>
@@ -2041,7 +1802,35 @@
                 <w:sz w:val="20"/>
                 <w:szCs w:val="20"/>
               </w:rPr>
-              <w:t>Translated business requirements into scalable technical solutions aligned with financial workflows.</w:t>
+              <w:t>Contributed to backend services and integrations in Java and SQL to support application functionality.</w:t>
+            </w:r>
+          </w:p>
+          <w:p>
+            <w:pPr>
+              <w:pStyle w:val="divdocumentparlrColmnsinglecolumnulli"/>
+              <w:numPr>
+                <w:ilvl w:val="0"/>
+                <w:numId w:val="5"/>
+              </w:numPr>
+              <w:spacing w:line="260" w:lineRule="atLeast"/>
+              <w:ind w:left="280" w:hanging="192"/>
+              <w:rPr>
+                <w:rStyle w:val="span"/>
+                <w:rFonts w:ascii="Palatino Linotype" w:eastAsia="Palatino Linotype" w:hAnsi="Palatino Linotype" w:cs="Palatino Linotype"/>
+                <w:color w:val="4A4A4A"/>
+                <w:sz w:val="20"/>
+                <w:szCs w:val="20"/>
+              </w:rPr>
+            </w:pPr>
+            <w:r>
+              <w:rPr>
+                <w:rStyle w:val="span"/>
+                <w:rFonts w:ascii="Palatino Linotype" w:eastAsia="Palatino Linotype" w:hAnsi="Palatino Linotype" w:cs="Palatino Linotype"/>
+                <w:color w:val="4A4A4A"/>
+                <w:sz w:val="20"/>
+                <w:szCs w:val="20"/>
+              </w:rPr>
+              <w:t>Developed financial applications and dashboards to enhance data visibility and support decision-making.</w:t>
             </w:r>
           </w:p>
         </w:tc>
@@ -2050,35 +1839,23 @@
     <w:p>
       <w:pPr>
         <w:pStyle w:val="divdocumentheading"/>
-        <w:pBdr>
-          <w:bottom w:val="none" w:sz="0" w:space="0" w:color="auto"/>
-        </w:pBdr>
         <w:tabs>
           <w:tab w:val="center" w:pos="10840"/>
         </w:tabs>
-        <w:spacing w:before="200" w:after="200" w:line="260" w:lineRule="atLeast"/>
+        <w:spacing w:before="300" w:line="260" w:lineRule="atLeast"/>
+        <w:rPr>
+          <w:rFonts w:ascii="Palatino Linotype" w:eastAsia="Palatino Linotype" w:hAnsi="Palatino Linotype" w:cs="Palatino Linotype"/>
+          <w:color w:val="4A4A4A"/>
+          <w:sz w:val="20"/>
+          <w:szCs w:val="20"/>
+        </w:rPr>
+      </w:pPr>
+      <w:r>
         <w:rPr>
           <w:rStyle w:val="divdocumentdivsectiontitle"/>
           <w:rFonts w:ascii="Palatino Linotype" w:eastAsia="Palatino Linotype" w:hAnsi="Palatino Linotype" w:cs="Palatino Linotype"/>
-          <w:b w:val="0"/>
-          <w:bCs w:val="0"/>
-          <w:strike/>
-          <w:color w:val="BCBFC3"/>
-        </w:rPr>
-      </w:pPr>
-      <w:r>
-        <w:rPr>
-          <w:rStyle w:val="divdocumentdivsectiontitle"/>
-          <w:rFonts w:ascii="Palatino Linotype" w:eastAsia="Palatino Linotype" w:hAnsi="Palatino Linotype" w:cs="Palatino Linotype"/>
-        </w:rPr>
-        <w:t>Education</w:t>
-      </w:r>
-      <w:r>
-        <w:rPr>
-          <w:rStyle w:val="divdocumentdivsectiontitle"/>
-          <w:rFonts w:ascii="Palatino Linotype" w:eastAsia="Palatino Linotype" w:hAnsi="Palatino Linotype" w:cs="Palatino Linotype"/>
-        </w:rPr>
-        <w:t xml:space="preserve">   </w:t>
+        </w:rPr>
+        <w:t xml:space="preserve">Education and Training   </w:t>
       </w:r>
       <w:r>
         <w:rPr>
@@ -2099,7 +1876,7 @@
     </w:p>
     <w:p>
       <w:pPr>
-        <w:pStyle w:val="spanpaddedline"/>
+        <w:pStyle w:val="divdocumentsinglecolumn"/>
         <w:spacing w:line="260" w:lineRule="atLeast"/>
         <w:rPr>
           <w:rFonts w:ascii="Palatino Linotype" w:eastAsia="Palatino Linotype" w:hAnsi="Palatino Linotype" w:cs="Palatino Linotype"/>
@@ -2110,12 +1887,161 @@
       </w:pPr>
       <w:r>
         <w:rPr>
+          <w:rStyle w:val="span"/>
           <w:rFonts w:ascii="Palatino Linotype" w:eastAsia="Palatino Linotype" w:hAnsi="Palatino Linotype" w:cs="Palatino Linotype"/>
           <w:color w:val="4A4A4A"/>
           <w:sz w:val="20"/>
           <w:szCs w:val="20"/>
         </w:rPr>
-        <w:t>B.S. in Computers, Mathematics and Economics — Kurukshetra University</w:t>
+        <w:t>Kurukshetra University | Kurukshetra</w:t>
+      </w:r>
+      <w:r>
+        <w:rPr>
+          <w:rStyle w:val="singlecolumnspanpaddedlinenth-child1"/>
+          <w:rFonts w:ascii="Palatino Linotype" w:eastAsia="Palatino Linotype" w:hAnsi="Palatino Linotype" w:cs="Palatino Linotype"/>
+          <w:color w:val="4A4A4A"/>
+          <w:sz w:val="20"/>
+          <w:szCs w:val="20"/>
+        </w:rPr>
+        <w:t xml:space="preserve"> </w:t>
+      </w:r>
+    </w:p>
+    <w:p>
+      <w:pPr>
+        <w:pStyle w:val="spanpaddedline"/>
+        <w:spacing w:line="260" w:lineRule="atLeast"/>
+        <w:rPr>
+          <w:rFonts w:ascii="Palatino Linotype" w:eastAsia="Palatino Linotype" w:hAnsi="Palatino Linotype" w:cs="Palatino Linotype"/>
+          <w:color w:val="4A4A4A"/>
+          <w:sz w:val="20"/>
+          <w:szCs w:val="20"/>
+        </w:rPr>
+      </w:pPr>
+      <w:r>
+        <w:rPr>
+          <w:rStyle w:val="degree"/>
+          <w:rFonts w:ascii="Palatino Linotype" w:eastAsia="Palatino Linotype" w:hAnsi="Palatino Linotype" w:cs="Palatino Linotype"/>
+          <w:color w:val="4A4A4A"/>
+          <w:sz w:val="20"/>
+          <w:szCs w:val="20"/>
+        </w:rPr>
+        <w:t>Bachelor of Science</w:t>
+      </w:r>
+      <w:r>
+        <w:rPr>
+          <w:rStyle w:val="span"/>
+          <w:rFonts w:ascii="Palatino Linotype" w:eastAsia="Palatino Linotype" w:hAnsi="Palatino Linotype" w:cs="Palatino Linotype"/>
+          <w:color w:val="4A4A4A"/>
+          <w:sz w:val="20"/>
+          <w:szCs w:val="20"/>
+        </w:rPr>
+        <w:t xml:space="preserve"> in Mathematics </w:t>
+      </w:r>
+      <w:proofErr w:type="gramStart"/>
+      <w:r>
+        <w:rPr>
+          <w:rStyle w:val="span"/>
+          <w:rFonts w:ascii="Palatino Linotype" w:eastAsia="Palatino Linotype" w:hAnsi="Palatino Linotype" w:cs="Palatino Linotype"/>
+          <w:color w:val="4A4A4A"/>
+          <w:sz w:val="20"/>
+          <w:szCs w:val="20"/>
+        </w:rPr>
+        <w:t>And</w:t>
+      </w:r>
+      <w:proofErr w:type="gramEnd"/>
+      <w:r>
+        <w:rPr>
+          <w:rStyle w:val="span"/>
+          <w:rFonts w:ascii="Palatino Linotype" w:eastAsia="Palatino Linotype" w:hAnsi="Palatino Linotype" w:cs="Palatino Linotype"/>
+          <w:color w:val="4A4A4A"/>
+          <w:sz w:val="20"/>
+          <w:szCs w:val="20"/>
+        </w:rPr>
+        <w:t xml:space="preserve"> Economics</w:t>
+      </w:r>
+      <w:r>
+        <w:rPr>
+          <w:rFonts w:ascii="Palatino Linotype" w:eastAsia="Palatino Linotype" w:hAnsi="Palatino Linotype" w:cs="Palatino Linotype"/>
+          <w:color w:val="4A4A4A"/>
+          <w:sz w:val="20"/>
+          <w:szCs w:val="20"/>
+        </w:rPr>
+        <w:t xml:space="preserve"> </w:t>
+      </w:r>
+    </w:p>
+    <w:p>
+      <w:pPr>
+        <w:pStyle w:val="divdocumentsinglecolumn"/>
+        <w:spacing w:before="200" w:line="260" w:lineRule="atLeast"/>
+        <w:rPr>
+          <w:rFonts w:ascii="Palatino Linotype" w:eastAsia="Palatino Linotype" w:hAnsi="Palatino Linotype" w:cs="Palatino Linotype"/>
+          <w:color w:val="4A4A4A"/>
+          <w:sz w:val="20"/>
+          <w:szCs w:val="20"/>
+        </w:rPr>
+      </w:pPr>
+      <w:r>
+        <w:rPr>
+          <w:rStyle w:val="span"/>
+          <w:rFonts w:ascii="Palatino Linotype" w:eastAsia="Palatino Linotype" w:hAnsi="Palatino Linotype" w:cs="Palatino Linotype"/>
+          <w:color w:val="4A4A4A"/>
+          <w:sz w:val="20"/>
+          <w:szCs w:val="20"/>
+        </w:rPr>
+        <w:t>IGNOU | Delhi</w:t>
+      </w:r>
+      <w:r>
+        <w:rPr>
+          <w:rStyle w:val="singlecolumnspanpaddedlinenth-child1"/>
+          <w:rFonts w:ascii="Palatino Linotype" w:eastAsia="Palatino Linotype" w:hAnsi="Palatino Linotype" w:cs="Palatino Linotype"/>
+          <w:color w:val="4A4A4A"/>
+          <w:sz w:val="20"/>
+          <w:szCs w:val="20"/>
+        </w:rPr>
+        <w:t xml:space="preserve"> </w:t>
+      </w:r>
+    </w:p>
+    <w:p>
+      <w:pPr>
+        <w:pStyle w:val="spanpaddedline"/>
+        <w:spacing w:line="260" w:lineRule="atLeast"/>
+        <w:rPr>
+          <w:rFonts w:ascii="Palatino Linotype" w:eastAsia="Palatino Linotype" w:hAnsi="Palatino Linotype" w:cs="Palatino Linotype"/>
+          <w:color w:val="4A4A4A"/>
+          <w:sz w:val="20"/>
+          <w:szCs w:val="20"/>
+        </w:rPr>
+      </w:pPr>
+      <w:proofErr w:type="gramStart"/>
+      <w:r>
+        <w:rPr>
+          <w:rStyle w:val="degree"/>
+          <w:rFonts w:ascii="Palatino Linotype" w:eastAsia="Palatino Linotype" w:hAnsi="Palatino Linotype" w:cs="Palatino Linotype"/>
+          <w:color w:val="4A4A4A"/>
+          <w:sz w:val="20"/>
+          <w:szCs w:val="20"/>
+        </w:rPr>
+        <w:t>Master in Computer Applications</w:t>
+      </w:r>
+      <w:proofErr w:type="gramEnd"/>
+      <w:r>
+        <w:rPr>
+          <w:rStyle w:val="span"/>
+          <w:rFonts w:ascii="Palatino Linotype" w:eastAsia="Palatino Linotype" w:hAnsi="Palatino Linotype" w:cs="Palatino Linotype"/>
+          <w:color w:val="4A4A4A"/>
+          <w:sz w:val="20"/>
+          <w:szCs w:val="20"/>
+        </w:rPr>
+        <w:t xml:space="preserve"> in Computer Applications</w:t>
+      </w:r>
+      <w:r>
+        <w:rPr>
+          <w:rFonts w:ascii="Palatino Linotype" w:eastAsia="Palatino Linotype" w:hAnsi="Palatino Linotype" w:cs="Palatino Linotype"/>
+          <w:color w:val="4A4A4A"/>
+          <w:sz w:val="20"/>
+          <w:szCs w:val="20"/>
+        </w:rPr>
+        <w:t xml:space="preserve"> </w:t>
       </w:r>
     </w:p>
     <w:p>
@@ -2137,56 +2063,6 @@
     </w:sectPr>
   </w:body>
 </w:document>
-</file>
-
-<file path=word/endnotes.xml><?xml version="1.0" encoding="utf-8"?>
-<w:endnotes xmlns:wpc="http://schemas.microsoft.com/office/word/2010/wordprocessingCanvas" xmlns:cx="http://schemas.microsoft.com/office/drawing/2014/chartex" xmlns:cx1="http://schemas.microsoft.com/office/drawing/2015/9/8/chartex" xmlns:cx2="http://schemas.microsoft.com/office/drawing/2015/10/21/chartex" xmlns:cx3="http://schemas.microsoft.com/office/drawing/2016/5/9/chartex" xmlns:cx4="http://schemas.microsoft.com/office/drawing/2016/5/10/chartex" xmlns:cx5="http://schemas.microsoft.com/office/drawing/2016/5/11/chartex" xmlns:cx6="http://schemas.microsoft.com/office/drawing/2016/5/12/chartex" xmlns:cx7="http://schemas.microsoft.com/office/drawing/2016/5/13/chartex" xmlns:cx8="http://schemas.microsoft.com/office/drawing/2016/5/14/chartex" xmlns:mc="http://schemas.openxmlformats.org/markup-compatibility/2006" xmlns:aink="http://schemas.microsoft.com/office/drawing/2016/ink" xmlns:am3d="http://schemas.microsoft.com/office/drawing/2017/model3d" xmlns:o="urn:schemas-microsoft-com:office:office" xmlns:oel="http://schemas.microsoft.com/office/2019/extlst" xmlns:r="http://schemas.openxmlformats.org/officeDocument/2006/relationships" xmlns:m="http://schemas.openxmlformats.org/officeDocument/2006/math" xmlns:v="urn:schemas-microsoft-com:vml" xmlns:wp14="http://schemas.microsoft.com/office/word/2010/wordprocessingDrawing" xmlns:wp="http://schemas.openxmlformats.org/drawingml/2006/wordprocessingDrawing" xmlns:w10="urn:schemas-microsoft-com:office:word" xmlns:w="http://schemas.openxmlformats.org/wordprocessingml/2006/main" xmlns:w14="http://schemas.microsoft.com/office/word/2010/wordml" xmlns:w15="http://schemas.microsoft.com/office/word/2012/wordml" xmlns:w16cex="http://schemas.microsoft.com/office/word/2018/wordml/cex" xmlns:w16cid="http://schemas.microsoft.com/office/word/2016/wordml/cid" xmlns:w16="http://schemas.microsoft.com/office/word/2018/wordml" xmlns:w16du="http://schemas.microsoft.com/office/word/2023/wordml/word16du" xmlns:w16sdtdh="http://schemas.microsoft.com/office/word/2020/wordml/sdtdatahash" xmlns:w16sdtfl="http://schemas.microsoft.com/office/word/2024/wordml/sdtformatlock" xmlns:w16se="http://schemas.microsoft.com/office/word/2015/wordml/symex" xmlns:wpg="http://schemas.microsoft.com/office/word/2010/wordprocessingGroup" xmlns:wpi="http://schemas.microsoft.com/office/word/2010/wordprocessingInk" xmlns:wne="http://schemas.microsoft.com/office/word/2006/wordml" xmlns:wps="http://schemas.microsoft.com/office/word/2010/wordprocessingShape" mc:Ignorable="w14 w15 w16se w16cid w16 w16cex w16sdtdh w16sdtfl w16du wp14">
-  <w:endnote w:type="separator" w:id="-1">
-    <w:p>
-      <w:pPr>
-        <w:spacing w:line="240" w:lineRule="auto"/>
-      </w:pPr>
-      <w:r>
-        <w:separator/>
-      </w:r>
-    </w:p>
-  </w:endnote>
-  <w:endnote w:type="continuationSeparator" w:id="0">
-    <w:p>
-      <w:pPr>
-        <w:spacing w:line="240" w:lineRule="auto"/>
-      </w:pPr>
-      <w:r>
-        <w:continuationSeparator/>
-      </w:r>
-    </w:p>
-  </w:endnote>
-</w:endnotes>
-</file>
-
-<file path=word/footnotes.xml><?xml version="1.0" encoding="utf-8"?>
-<w:footnotes xmlns:wpc="http://schemas.microsoft.com/office/word/2010/wordprocessingCanvas" xmlns:cx="http://schemas.microsoft.com/office/drawing/2014/chartex" xmlns:cx1="http://schemas.microsoft.com/office/drawing/2015/9/8/chartex" xmlns:cx2="http://schemas.microsoft.com/office/drawing/2015/10/21/chartex" xmlns:cx3="http://schemas.microsoft.com/office/drawing/2016/5/9/chartex" xmlns:cx4="http://schemas.microsoft.com/office/drawing/2016/5/10/chartex" xmlns:cx5="http://schemas.microsoft.com/office/drawing/2016/5/11/chartex" xmlns:cx6="http://schemas.microsoft.com/office/drawing/2016/5/12/chartex" xmlns:cx7="http://schemas.microsoft.com/office/drawing/2016/5/13/chartex" xmlns:cx8="http://schemas.microsoft.com/office/drawing/2016/5/14/chartex" xmlns:mc="http://schemas.openxmlformats.org/markup-compatibility/2006" xmlns:aink="http://schemas.microsoft.com/office/drawing/2016/ink" xmlns:am3d="http://schemas.microsoft.com/office/drawing/2017/model3d" xmlns:o="urn:schemas-microsoft-com:office:office" xmlns:oel="http://schemas.microsoft.com/office/2019/extlst" xmlns:r="http://schemas.openxmlformats.org/officeDocument/2006/relationships" xmlns:m="http://schemas.openxmlformats.org/officeDocument/2006/math" xmlns:v="urn:schemas-microsoft-com:vml" xmlns:wp14="http://schemas.microsoft.com/office/word/2010/wordprocessingDrawing" xmlns:wp="http://schemas.openxmlformats.org/drawingml/2006/wordprocessingDrawing" xmlns:w10="urn:schemas-microsoft-com:office:word" xmlns:w="http://schemas.openxmlformats.org/wordprocessingml/2006/main" xmlns:w14="http://schemas.microsoft.com/office/word/2010/wordml" xmlns:w15="http://schemas.microsoft.com/office/word/2012/wordml" xmlns:w16cex="http://schemas.microsoft.com/office/word/2018/wordml/cex" xmlns:w16cid="http://schemas.microsoft.com/office/word/2016/wordml/cid" xmlns:w16="http://schemas.microsoft.com/office/word/2018/wordml" xmlns:w16du="http://schemas.microsoft.com/office/word/2023/wordml/word16du" xmlns:w16sdtdh="http://schemas.microsoft.com/office/word/2020/wordml/sdtdatahash" xmlns:w16sdtfl="http://schemas.microsoft.com/office/word/2024/wordml/sdtformatlock" xmlns:w16se="http://schemas.microsoft.com/office/word/2015/wordml/symex" xmlns:wpg="http://schemas.microsoft.com/office/word/2010/wordprocessingGroup" xmlns:wpi="http://schemas.microsoft.com/office/word/2010/wordprocessingInk" xmlns:wne="http://schemas.microsoft.com/office/word/2006/wordml" xmlns:wps="http://schemas.microsoft.com/office/word/2010/wordprocessingShape" mc:Ignorable="w14 w15 w16se w16cid w16 w16cex w16sdtdh w16sdtfl w16du wp14">
-  <w:footnote w:type="separator" w:id="-1">
-    <w:p>
-      <w:pPr>
-        <w:spacing w:line="240" w:lineRule="auto"/>
-      </w:pPr>
-      <w:r>
-        <w:separator/>
-      </w:r>
-    </w:p>
-  </w:footnote>
-  <w:footnote w:type="continuationSeparator" w:id="0">
-    <w:p>
-      <w:pPr>
-        <w:spacing w:line="240" w:lineRule="auto"/>
-      </w:pPr>
-      <w:r>
-        <w:continuationSeparator/>
-      </w:r>
-    </w:p>
-  </w:footnote>
-</w:footnotes>
 </file>
 
 <file path=word/numbering.xml><?xml version="1.0" encoding="utf-8"?>
@@ -3421,6 +3297,7 @@
   <w:style w:type="character" w:default="1" w:styleId="DefaultParagraphFont">
     <w:name w:val="Default Paragraph Font"/>
     <w:uiPriority w:val="1"/>
+    <w:semiHidden/>
     <w:unhideWhenUsed/>
   </w:style>
   <w:style w:type="table" w:default="1" w:styleId="TableNormal">
@@ -3731,92 +3608,6 @@
     <w:rPr>
       <w:b/>
       <w:bCs/>
-    </w:rPr>
-  </w:style>
-  <w:style w:type="character" w:styleId="Hyperlink">
-    <w:name w:val="Hyperlink"/>
-    <w:basedOn w:val="DefaultParagraphFont"/>
-    <w:uiPriority w:val="99"/>
-    <w:unhideWhenUsed/>
-    <w:rsid w:val="007102F4"/>
-    <w:rPr>
-      <w:color w:val="0000FF"/>
-      <w:u w:val="single"/>
-    </w:rPr>
-  </w:style>
-  <w:style w:type="character" w:styleId="FollowedHyperlink">
-    <w:name w:val="FollowedHyperlink"/>
-    <w:basedOn w:val="DefaultParagraphFont"/>
-    <w:uiPriority w:val="99"/>
-    <w:semiHidden/>
-    <w:unhideWhenUsed/>
-    <w:rsid w:val="00DB6666"/>
-    <w:rPr>
-      <w:color w:val="800080" w:themeColor="followedHyperlink"/>
-      <w:u w:val="single"/>
-    </w:rPr>
-  </w:style>
-  <w:style w:type="character" w:styleId="Strong">
-    <w:name w:val="Strong"/>
-    <w:basedOn w:val="DefaultParagraphFont"/>
-    <w:uiPriority w:val="22"/>
-    <w:qFormat/>
-    <w:rsid w:val="00C80CE7"/>
-    <w:rPr>
-      <w:b/>
-      <w:bCs/>
-    </w:rPr>
-  </w:style>
-  <w:style w:type="paragraph" w:styleId="Header">
-    <w:name w:val="header"/>
-    <w:basedOn w:val="Normal"/>
-    <w:link w:val="HeaderChar"/>
-    <w:uiPriority w:val="99"/>
-    <w:unhideWhenUsed/>
-    <w:rsid w:val="008A3266"/>
-    <w:pPr>
-      <w:tabs>
-        <w:tab w:val="center" w:pos="4680"/>
-        <w:tab w:val="right" w:pos="9360"/>
-      </w:tabs>
-      <w:spacing w:line="240" w:lineRule="auto"/>
-    </w:pPr>
-  </w:style>
-  <w:style w:type="character" w:customStyle="1" w:styleId="HeaderChar">
-    <w:name w:val="Header Char"/>
-    <w:basedOn w:val="DefaultParagraphFont"/>
-    <w:link w:val="Header"/>
-    <w:uiPriority w:val="99"/>
-    <w:rsid w:val="008A3266"/>
-    <w:rPr>
-      <w:sz w:val="24"/>
-      <w:szCs w:val="24"/>
-    </w:rPr>
-  </w:style>
-  <w:style w:type="paragraph" w:styleId="Footer">
-    <w:name w:val="footer"/>
-    <w:basedOn w:val="Normal"/>
-    <w:link w:val="FooterChar"/>
-    <w:uiPriority w:val="99"/>
-    <w:unhideWhenUsed/>
-    <w:rsid w:val="008A3266"/>
-    <w:pPr>
-      <w:tabs>
-        <w:tab w:val="center" w:pos="4680"/>
-        <w:tab w:val="right" w:pos="9360"/>
-      </w:tabs>
-      <w:spacing w:line="240" w:lineRule="auto"/>
-    </w:pPr>
-  </w:style>
-  <w:style w:type="character" w:customStyle="1" w:styleId="FooterChar">
-    <w:name w:val="Footer Char"/>
-    <w:basedOn w:val="DefaultParagraphFont"/>
-    <w:link w:val="Footer"/>
-    <w:uiPriority w:val="99"/>
-    <w:rsid w:val="008A3266"/>
-    <w:rPr>
-      <w:sz w:val="24"/>
-      <w:szCs w:val="24"/>
     </w:rPr>
   </w:style>
 </w:styles>

</xml_diff>